<commit_message>
Add sick pay and September 2024 wages to Omer Almo claim
Overtime now pleaded on 12-hour shifts with payslip-based floor;
claim total raised to 70,090 ILS.

Co-Authored-By: Claude Fable 5.1 <noreply@anthropic.com>
Claude-Session: https://claude.ai/code/session_01LZZvntJ3pJMoHrEfkbpmK5
</commit_message>
<xml_diff>
--- a/labor-claim-omer-almo/כתב_תביעה_עומר_אלמו.docx
+++ b/labor-claim-omer-almo/כתב_תביעה_עומר_אלמו.docx
@@ -478,7 +478,7 @@
           <w:szCs w:val="23"/>
           <w:rtl/>
         </w:rPr>
-        <w:t xml:space="preserve">פיצויי פיטורים, גמול שעות נוספות, פדיון חופשה, דמי חגים ופיצוי לדוגמה (עובד קטין).</w:t>
+        <w:t xml:space="preserve">שכר עבודה, גמול שעות נוספות, פיצויי פיטורים, פדיון חופשה, דמי חגים, דמי מחלה ופיצוי לדוגמה (עובד קטין).</w:t>
       </w:r>
     </w:p>
     <w:p>
@@ -505,7 +505,7 @@
           <w:szCs w:val="23"/>
           <w:rtl/>
         </w:rPr>
-        <w:t xml:space="preserve">38,100 ₪.</w:t>
+        <w:t xml:space="preserve">70,090 ₪.</w:t>
       </w:r>
     </w:p>
     <w:p>
@@ -713,7 +713,7 @@
           <w:szCs w:val="23"/>
           <w:rtl/>
         </w:rPr>
-        <w:t xml:space="preserve">העסקת התובע הסתיימה ביום 28.9.2024 עקב גיוסו לשירות סדיר בצה"ל. התפטרות עקב גיוס דינה כפיטורים לעניין פיצויי פיטורים, מכוח סעיף 11(ג) לחוק פיצויי פיטורים, התשכ"ג-1963. הנתבעת לא ערכה לתובע גמר חשבון ולא שילמה לו דבר בגין זכויותיו.</w:t>
+        <w:t xml:space="preserve">העסקת התובע הסתיימה ביום 28.9.2024 עקב גיוסו לשירות סדיר בצה"ל. התפטרות עקב גיוס דינה כפיטורים לעניין פיצויי פיטורים, מכוח סעיף 11(ג) לחוק פיצויי פיטורים, התשכ"ג-1963. הנתבעת לא ערכה לתובע גמר חשבון, לא שילמה לו את שכר חודש 9/2024 ואף לא הנפיקה לו תלוש לחודש זה, ולא שילמה לו דבר בגין זכויותיו.</w:t>
       </w:r>
     </w:p>
     <w:p>
@@ -805,7 +805,7 @@
           <w:szCs w:val="23"/>
           <w:rtl/>
         </w:rPr>
-        <w:t xml:space="preserve">מרישומי הנתבעת עצמה בתלושים עולה כי התובע הועסק דרך קבע במשמרות שחרגו משמונה שעות, ובחלק מהחודשים (5-6/2023, 12/2023, 1/2024) במשמרות של 12-13 שעות בממוצע. סעיף 20 לחוק עבודת הנוער אוסר להעסיק נער מעבר לשמונה שעות ביום, וסעיף 16 לחוק שעות עבודה ומנוחה, התשי"א-1951, מחייב גמול של 125% ו-150%. הנתבעת לא ניהלה פנקס שעות כדין, ומכוח סעיף 26ב לחוק הגנת השכר, התשי"ח-1958, נטל ההוכחה בעניין היקף השעות מוטל עליה.</w:t>
+        <w:t xml:space="preserve">מרישומי הנתבעת עצמה בתלושים עולה כי התובע הועסק דרך קבע במשמרות שחרגו משמונה שעות, ובחלק מהחודשים (5-6/2023, 12/2023, 1/2024) במשמרות של 12-13 שעות בממוצע. בפועל הועסק התובע דרך קבע במשמרות אירועים בנות 11-13 שעות, ורישומי הנתבעת משקפים רק חלק מהן. סעיף 20 לחוק עבודת הנוער אוסר להעסיק נער מעבר לשמונה שעות ביום, וסעיף 16 לחוק שעות עבודה ומנוחה, התשי"א-1951, מחייב גמול של 125% ו-150%. הנתבעת לא ניהלה פנקס שעות כדין, ומכוח סעיף 26ב לחוק הגנת השכר, התשי"ח-1958, נטל ההוכחה בעניין היקף השעות מוטל עליה.</w:t>
       </w:r>
     </w:p>
     <w:p>
@@ -934,6 +934,38 @@
           <w:rtl/>
         </w:rPr>
         <w:t xml:space="preserve">לא נמסרה לתובע הודעה על תנאי עבודתו, בניגוד לחוק הודעה לעובד ולמועמד לעבודה, התשס"ב-2002, ותלושי השכר לא נמסרו לו במועדם בניגוד לסעיף 24 לחוק הגנת השכר. כל אחת מההפרות מקימה זכות לפיצוי לדוגמה ללא הוכחת נזק.</w:t>
+      </w:r>
+    </w:p>
+    <w:p>
+      <w:pPr>
+        <w:pStyle w:val="ListParagraph"/>
+        <w:numPr>
+          <w:ilvl w:val="0"/>
+          <w:numId w:val="2"/>
+        </w:numPr>
+        <w:bidi/>
+        <w:spacing w:after="100" w:before="0" w:line="276" w:lineRule="auto"/>
+        <w:jc w:val="both"/>
+      </w:pPr>
+      <w:r>
+        <w:rPr>
+          <w:rFonts w:ascii="David" w:cs="David" w:eastAsia="David" w:hAnsi="David"/>
+          <w:b/>
+          <w:bCs/>
+          <w:sz w:val="23"/>
+          <w:szCs w:val="23"/>
+          <w:rtl/>
+        </w:rPr>
+        <w:t xml:space="preserve">דמי מחלה ושכר חודש 9/2024: </w:t>
+      </w:r>
+      <w:r>
+        <w:rPr>
+          <w:rFonts w:ascii="David" w:cs="David" w:eastAsia="David" w:hAnsi="David"/>
+          <w:sz w:val="23"/>
+          <w:szCs w:val="23"/>
+          <w:rtl/>
+        </w:rPr>
+        <w:t xml:space="preserve">התובע נעדר מעבודתו עקב מחלה ולא שולמו לו דמי מחלה, אף שלפי תלושי הנתבעת עצמה צבר 18.9 ימי מחלה שלא נוצלו, בניגוד לחוק דמי מחלה, התשל"ו-1976. כמו כן, בגין עבודתו בחודש ספטמבר 2024, עד 28.9.2024, לא שולם לתובע שכר כלל.</w:t>
       </w:r>
     </w:p>
     <w:p>
@@ -1036,27 +1068,27 @@
           <w:szCs w:val="23"/>
           <w:rtl/>
         </w:rPr>
-        <w:t xml:space="preserve">475 שעות מעבר לשמונה שעות ביום, לפי התלושים, × 30 ₪ × 137.5%, ממוצע התעריפים 125% ו-150%, = 19,594 ₪, בניכוי 8,545 ₪ ששולמו כשכר יסוד שעתי, ובסה"כ </w:t>
-      </w:r>
-      <w:r>
-        <w:rPr>
-          <w:rFonts w:ascii="David" w:cs="David" w:eastAsia="David" w:hAnsi="David"/>
-          <w:b/>
-          <w:bCs/>
-          <w:sz w:val="23"/>
-          <w:szCs w:val="23"/>
-          <w:rtl/>
-        </w:rPr>
-        <w:t xml:space="preserve">11,049 ₪</w:t>
-      </w:r>
-      <w:r>
-        <w:rPr>
-          <w:rFonts w:ascii="David" w:cs="David" w:eastAsia="David" w:hAnsi="David"/>
-          <w:sz w:val="23"/>
-          <w:szCs w:val="23"/>
-          <w:rtl/>
-        </w:rPr>
-        <w:t xml:space="preserve">. התובע שומר על זכותו להגדיל רכיב זה עם גילוי רישומי הנוכחות.</w:t>
+        <w:t xml:space="preserve">281 משמרות לפי התלושים × 4 שעות נוספות למשמרת (משמרת של 12 שעות) = 1,124 שעות × 30 ₪ × 137.5%, ממוצע התעריפים 125% ו-150%, = 46,365 ₪, בניכוי 8,545 ₪ ששולמו כשכר יסוד שעתי, ובסה"כ </w:t>
+      </w:r>
+      <w:r>
+        <w:rPr>
+          <w:rFonts w:ascii="David" w:cs="David" w:eastAsia="David" w:hAnsi="David"/>
+          <w:b/>
+          <w:bCs/>
+          <w:sz w:val="23"/>
+          <w:szCs w:val="23"/>
+          <w:rtl/>
+        </w:rPr>
+        <w:t xml:space="preserve">37,820 ₪</w:t>
+      </w:r>
+      <w:r>
+        <w:rPr>
+          <w:rFonts w:ascii="David" w:cs="David" w:eastAsia="David" w:hAnsi="David"/>
+          <w:sz w:val="23"/>
+          <w:szCs w:val="23"/>
+          <w:rtl/>
+        </w:rPr>
+        <w:t xml:space="preserve">. החישוב נופל מחזקת 15 השעות הנוספות השבועיות שבסעיף 26ב לחוק הגנת השכר. לחלופין, ולכל הפחות, לפי רישומי הנתבעת עצמה בתלושים: 475 שעות נוספות, ובסה"כ 11,049 ₪.</w:t>
       </w:r>
     </w:p>
     <w:p>
@@ -1183,6 +1215,110 @@
           <w:szCs w:val="23"/>
           <w:rtl/>
         </w:rPr>
+        <w:t xml:space="preserve">דמי מחלה: </w:t>
+      </w:r>
+      <w:r>
+        <w:rPr>
+          <w:rFonts w:ascii="David" w:cs="David" w:eastAsia="David" w:hAnsi="David"/>
+          <w:sz w:val="23"/>
+          <w:szCs w:val="23"/>
+          <w:rtl/>
+        </w:rPr>
+        <w:t xml:space="preserve">על דרך האומדן, 10 ימי היעדרות בשתי תקופות מחלה, השווים ל-6 ימי תשלום לפי סעיף 2 לחוק דמי מחלה × 286.44 ₪ = </w:t>
+      </w:r>
+      <w:r>
+        <w:rPr>
+          <w:rFonts w:ascii="David" w:cs="David" w:eastAsia="David" w:hAnsi="David"/>
+          <w:b/>
+          <w:bCs/>
+          <w:sz w:val="23"/>
+          <w:szCs w:val="23"/>
+          <w:rtl/>
+        </w:rPr>
+        <w:t xml:space="preserve">1,719 ₪</w:t>
+      </w:r>
+      <w:r>
+        <w:rPr>
+          <w:rFonts w:ascii="David" w:cs="David" w:eastAsia="David" w:hAnsi="David"/>
+          <w:sz w:val="23"/>
+          <w:szCs w:val="23"/>
+          <w:rtl/>
+        </w:rPr>
+        <w:t xml:space="preserve">.</w:t>
+      </w:r>
+    </w:p>
+    <w:p>
+      <w:pPr>
+        <w:pStyle w:val="ListParagraph"/>
+        <w:numPr>
+          <w:ilvl w:val="0"/>
+          <w:numId w:val="2"/>
+        </w:numPr>
+        <w:bidi/>
+        <w:spacing w:after="100" w:before="0" w:line="276" w:lineRule="auto"/>
+        <w:jc w:val="both"/>
+      </w:pPr>
+      <w:r>
+        <w:rPr>
+          <w:rFonts w:ascii="David" w:cs="David" w:eastAsia="David" w:hAnsi="David"/>
+          <w:b/>
+          <w:bCs/>
+          <w:sz w:val="23"/>
+          <w:szCs w:val="23"/>
+          <w:rtl/>
+        </w:rPr>
+        <w:t xml:space="preserve">שכר חודש 9/2024: </w:t>
+      </w:r>
+      <w:r>
+        <w:rPr>
+          <w:rFonts w:ascii="David" w:cs="David" w:eastAsia="David" w:hAnsi="David"/>
+          <w:sz w:val="23"/>
+          <w:szCs w:val="23"/>
+          <w:rtl/>
+        </w:rPr>
+        <w:t xml:space="preserve">בהעדר תלוש ורישום, לפי השכר הקובע = </w:t>
+      </w:r>
+      <w:r>
+        <w:rPr>
+          <w:rFonts w:ascii="David" w:cs="David" w:eastAsia="David" w:hAnsi="David"/>
+          <w:b/>
+          <w:bCs/>
+          <w:sz w:val="23"/>
+          <w:szCs w:val="23"/>
+          <w:rtl/>
+        </w:rPr>
+        <w:t xml:space="preserve">3,500 ₪</w:t>
+      </w:r>
+      <w:r>
+        <w:rPr>
+          <w:rFonts w:ascii="David" w:cs="David" w:eastAsia="David" w:hAnsi="David"/>
+          <w:sz w:val="23"/>
+          <w:szCs w:val="23"/>
+          <w:rtl/>
+        </w:rPr>
+        <w:t xml:space="preserve">.</w:t>
+      </w:r>
+    </w:p>
+    <w:p>
+      <w:pPr>
+        <w:pStyle w:val="ListParagraph"/>
+        <w:numPr>
+          <w:ilvl w:val="0"/>
+          <w:numId w:val="2"/>
+        </w:numPr>
+        <w:bidi/>
+        <w:spacing w:after="100" w:before="0" w:line="276" w:lineRule="auto"/>
+        <w:jc w:val="both"/>
+      </w:pPr>
+      <w:r>
+        <w:rPr>
+          <w:rFonts w:ascii="David" w:cs="David" w:eastAsia="David" w:hAnsi="David"/>
+          <w:b/>
+          <w:bCs/>
+          <w:sz w:val="23"/>
+          <w:szCs w:val="23"/>
+          <w:rtl/>
+        </w:rPr>
         <w:t xml:space="preserve">פיצוי לדוגמה: </w:t>
       </w:r>
       <w:r>
@@ -1244,7 +1380,7 @@
           <w:szCs w:val="23"/>
           <w:rtl/>
         </w:rPr>
-        <w:t xml:space="preserve">38,100 ₪</w:t>
+        <w:t xml:space="preserve">70,090 ₪</w:t>
       </w:r>
       <w:r>
         <w:rPr>
@@ -1295,7 +1431,7 @@
           <w:szCs w:val="23"/>
           <w:rtl/>
         </w:rPr>
-        <w:t xml:space="preserve">התובע שומר על זכותו לתקן את כתב התביעה ולהוסיף עליו, לרבות בגין דמי מחלה ושכר חודש 9/2024, עם קבלת מלוא המסמכים מהנתבעת, ואין באמור לעיל כדי לגרוע מכל זכות העומדת לו על פי כל דין, הסכם, נוהג או צו הרחבה.</w:t>
+        <w:t xml:space="preserve">התובע שומר על זכותו לתקן את כתב התביעה ולהוסיף עליו עם קבלת מלוא המסמכים מהנתבעת, ואין באמור לעיל כדי לגרוע מכל זכות העומדת לו על פי כל דין, הסכם, נוהג או צו הרחבה.</w:t>
       </w:r>
     </w:p>
     <w:p>

</xml_diff>

<commit_message>
Set Omer Almo claim to 52,226 ILS: overtime on 11-hour shifts, drop sick pay and September wages
Co-Authored-By: Claude Fable 5.1 <noreply@anthropic.com>
Claude-Session: https://claude.ai/code/session_01LZZvntJ3pJMoHrEfkbpmK5
</commit_message>
<xml_diff>
--- a/labor-claim-omer-almo/כתב_תביעה_עומר_אלמו.docx
+++ b/labor-claim-omer-almo/כתב_תביעה_עומר_אלמו.docx
@@ -478,7 +478,7 @@
           <w:szCs w:val="23"/>
           <w:rtl/>
         </w:rPr>
-        <w:t xml:space="preserve">שכר עבודה, גמול שעות נוספות, פיצויי פיטורים, פדיון חופשה, דמי חגים, דמי מחלה ופיצוי לדוגמה (עובד קטין).</w:t>
+        <w:t xml:space="preserve">פיצויי פיטורים, גמול שעות נוספות, פדיון חופשה, דמי חגים ופיצוי לדוגמה (עובד קטין).</w:t>
       </w:r>
     </w:p>
     <w:p>
@@ -505,7 +505,7 @@
           <w:szCs w:val="23"/>
           <w:rtl/>
         </w:rPr>
-        <w:t xml:space="preserve">70,090 ₪.</w:t>
+        <w:t xml:space="preserve">52,226 ₪.</w:t>
       </w:r>
     </w:p>
     <w:p>
@@ -713,7 +713,7 @@
           <w:szCs w:val="23"/>
           <w:rtl/>
         </w:rPr>
-        <w:t xml:space="preserve">העסקת התובע הסתיימה ביום 28.9.2024 עקב גיוסו לשירות סדיר בצה"ל. התפטרות עקב גיוס דינה כפיטורים לעניין פיצויי פיטורים, מכוח סעיף 11(ג) לחוק פיצויי פיטורים, התשכ"ג-1963. הנתבעת לא ערכה לתובע גמר חשבון, לא שילמה לו את שכר חודש 9/2024 ואף לא הנפיקה לו תלוש לחודש זה, ולא שילמה לו דבר בגין זכויותיו.</w:t>
+        <w:t xml:space="preserve">העסקת התובע הסתיימה ביום 28.9.2024 עקב גיוסו לשירות סדיר בצה"ל. התפטרות עקב גיוס דינה כפיטורים לעניין פיצויי פיטורים, מכוח סעיף 11(ג) לחוק פיצויי פיטורים, התשכ"ג-1963. הנתבעת לא ערכה לתובע גמר חשבון ולא שילמה לו דבר בגין זכויותיו.</w:t>
       </w:r>
     </w:p>
     <w:p>
@@ -938,6 +938,25 @@
     </w:p>
     <w:p>
       <w:pPr>
+        <w:bidi/>
+        <w:spacing w:after="60" w:before="60" w:line="276" w:lineRule="auto"/>
+        <w:jc w:val="start"/>
+      </w:pPr>
+      <w:r>
+        <w:rPr>
+          <w:rFonts w:ascii="David" w:cs="David" w:eastAsia="David" w:hAnsi="David"/>
+          <w:b/>
+          <w:bCs/>
+          <w:sz w:val="23"/>
+          <w:szCs w:val="23"/>
+          <w:u w:val="single"/>
+          <w:rtl/>
+        </w:rPr>
+        <w:t xml:space="preserve">ג. הסעדים</w:t>
+      </w:r>
+    </w:p>
+    <w:p>
+      <w:pPr>
         <w:pStyle w:val="ListParagraph"/>
         <w:numPr>
           <w:ilvl w:val="0"/>
@@ -956,35 +975,36 @@
           <w:szCs w:val="23"/>
           <w:rtl/>
         </w:rPr>
-        <w:t xml:space="preserve">דמי מחלה ושכר חודש 9/2024: </w:t>
-      </w:r>
-      <w:r>
-        <w:rPr>
-          <w:rFonts w:ascii="David" w:cs="David" w:eastAsia="David" w:hAnsi="David"/>
-          <w:sz w:val="23"/>
-          <w:szCs w:val="23"/>
-          <w:rtl/>
-        </w:rPr>
-        <w:t xml:space="preserve">התובע נעדר מעבודתו עקב מחלה ולא שולמו לו דמי מחלה, אף שלפי תלושי הנתבעת עצמה צבר 18.9 ימי מחלה שלא נוצלו, בניגוד לחוק דמי מחלה, התשל"ו-1976. כמו כן, בגין עבודתו בחודש ספטמבר 2024, עד 28.9.2024, לא שולם לתובע שכר כלל.</w:t>
-      </w:r>
-    </w:p>
-    <w:p>
-      <w:pPr>
-        <w:bidi/>
-        <w:spacing w:after="60" w:before="60" w:line="276" w:lineRule="auto"/>
-        <w:jc w:val="start"/>
-      </w:pPr>
-      <w:r>
-        <w:rPr>
-          <w:rFonts w:ascii="David" w:cs="David" w:eastAsia="David" w:hAnsi="David"/>
-          <w:b/>
-          <w:bCs/>
-          <w:sz w:val="23"/>
-          <w:szCs w:val="23"/>
-          <w:u w:val="single"/>
-          <w:rtl/>
-        </w:rPr>
-        <w:t xml:space="preserve">ג. הסעדים</w:t>
+        <w:t xml:space="preserve">פיצויי פיטורים: </w:t>
+      </w:r>
+      <w:r>
+        <w:rPr>
+          <w:rFonts w:ascii="David" w:cs="David" w:eastAsia="David" w:hAnsi="David"/>
+          <w:sz w:val="23"/>
+          <w:szCs w:val="23"/>
+          <w:rtl/>
+        </w:rPr>
+        <w:t xml:space="preserve">3,500 ₪ × 29/12 חודשי עבודה = </w:t>
+      </w:r>
+      <w:r>
+        <w:rPr>
+          <w:rFonts w:ascii="David" w:cs="David" w:eastAsia="David" w:hAnsi="David"/>
+          <w:b/>
+          <w:bCs/>
+          <w:sz w:val="23"/>
+          <w:szCs w:val="23"/>
+          <w:rtl/>
+        </w:rPr>
+        <w:t xml:space="preserve">8,458 ₪</w:t>
+      </w:r>
+      <w:r>
+        <w:rPr>
+          <w:rFonts w:ascii="David" w:cs="David" w:eastAsia="David" w:hAnsi="David"/>
+          <w:sz w:val="23"/>
+          <w:szCs w:val="23"/>
+          <w:rtl/>
+        </w:rPr>
+        <w:t xml:space="preserve">.</w:t>
       </w:r>
     </w:p>
     <w:p>
@@ -1007,36 +1027,36 @@
           <w:szCs w:val="23"/>
           <w:rtl/>
         </w:rPr>
-        <w:t xml:space="preserve">פיצויי פיטורים: </w:t>
-      </w:r>
-      <w:r>
-        <w:rPr>
-          <w:rFonts w:ascii="David" w:cs="David" w:eastAsia="David" w:hAnsi="David"/>
-          <w:sz w:val="23"/>
-          <w:szCs w:val="23"/>
-          <w:rtl/>
-        </w:rPr>
-        <w:t xml:space="preserve">3,500 ₪ × 29/12 חודשי עבודה = </w:t>
-      </w:r>
-      <w:r>
-        <w:rPr>
-          <w:rFonts w:ascii="David" w:cs="David" w:eastAsia="David" w:hAnsi="David"/>
-          <w:b/>
-          <w:bCs/>
-          <w:sz w:val="23"/>
-          <w:szCs w:val="23"/>
-          <w:rtl/>
-        </w:rPr>
-        <w:t xml:space="preserve">8,458 ₪</w:t>
-      </w:r>
-      <w:r>
-        <w:rPr>
-          <w:rFonts w:ascii="David" w:cs="David" w:eastAsia="David" w:hAnsi="David"/>
-          <w:sz w:val="23"/>
-          <w:szCs w:val="23"/>
-          <w:rtl/>
-        </w:rPr>
-        <w:t xml:space="preserve">.</w:t>
+        <w:t xml:space="preserve">גמול שעות נוספות: </w:t>
+      </w:r>
+      <w:r>
+        <w:rPr>
+          <w:rFonts w:ascii="David" w:cs="David" w:eastAsia="David" w:hAnsi="David"/>
+          <w:sz w:val="23"/>
+          <w:szCs w:val="23"/>
+          <w:rtl/>
+        </w:rPr>
+        <w:t xml:space="preserve">281 משמרות לפי התלושים × 3 שעות נוספות למשמרת (משמרת ממוצעת של 11 שעות): שתי שעות ב-125% ושעה ב-150%, 120 ₪ למשמרת לפי 30 ₪ לשעה, = 33,720 ₪, בניכוי 8,545 ₪ ששולמו כשכר יסוד שעתי, ובסה"כ </w:t>
+      </w:r>
+      <w:r>
+        <w:rPr>
+          <w:rFonts w:ascii="David" w:cs="David" w:eastAsia="David" w:hAnsi="David"/>
+          <w:b/>
+          <w:bCs/>
+          <w:sz w:val="23"/>
+          <w:szCs w:val="23"/>
+          <w:rtl/>
+        </w:rPr>
+        <w:t xml:space="preserve">25,175 ₪</w:t>
+      </w:r>
+      <w:r>
+        <w:rPr>
+          <w:rFonts w:ascii="David" w:cs="David" w:eastAsia="David" w:hAnsi="David"/>
+          <w:sz w:val="23"/>
+          <w:szCs w:val="23"/>
+          <w:rtl/>
+        </w:rPr>
+        <w:t xml:space="preserve">. החישוב נופל מחזקת 15 השעות הנוספות השבועיות שבסעיף 26ב לחוק הגנת השכר. לחלופין, ולכל הפחות, לפי רישומי הנתבעת עצמה בתלושים: 475 שעות נוספות, ובסה"כ 11,049 ₪.</w:t>
       </w:r>
     </w:p>
     <w:p>
@@ -1059,36 +1079,36 @@
           <w:szCs w:val="23"/>
           <w:rtl/>
         </w:rPr>
-        <w:t xml:space="preserve">גמול שעות נוספות: </w:t>
-      </w:r>
-      <w:r>
-        <w:rPr>
-          <w:rFonts w:ascii="David" w:cs="David" w:eastAsia="David" w:hAnsi="David"/>
-          <w:sz w:val="23"/>
-          <w:szCs w:val="23"/>
-          <w:rtl/>
-        </w:rPr>
-        <w:t xml:space="preserve">281 משמרות לפי התלושים × 4 שעות נוספות למשמרת (משמרת של 12 שעות) = 1,124 שעות × 30 ₪ × 137.5%, ממוצע התעריפים 125% ו-150%, = 46,365 ₪, בניכוי 8,545 ₪ ששולמו כשכר יסוד שעתי, ובסה"כ </w:t>
-      </w:r>
-      <w:r>
-        <w:rPr>
-          <w:rFonts w:ascii="David" w:cs="David" w:eastAsia="David" w:hAnsi="David"/>
-          <w:b/>
-          <w:bCs/>
-          <w:sz w:val="23"/>
-          <w:szCs w:val="23"/>
-          <w:rtl/>
-        </w:rPr>
-        <w:t xml:space="preserve">37,820 ₪</w:t>
-      </w:r>
-      <w:r>
-        <w:rPr>
-          <w:rFonts w:ascii="David" w:cs="David" w:eastAsia="David" w:hAnsi="David"/>
-          <w:sz w:val="23"/>
-          <w:szCs w:val="23"/>
-          <w:rtl/>
-        </w:rPr>
-        <w:t xml:space="preserve">. החישוב נופל מחזקת 15 השעות הנוספות השבועיות שבסעיף 26ב לחוק הגנת השכר. לחלופין, ולכל הפחות, לפי רישומי הנתבעת עצמה בתלושים: 475 שעות נוספות, ובסה"כ 11,049 ₪.</w:t>
+        <w:t xml:space="preserve">פדיון חופשה: </w:t>
+      </w:r>
+      <w:r>
+        <w:rPr>
+          <w:rFonts w:ascii="David" w:cs="David" w:eastAsia="David" w:hAnsi="David"/>
+          <w:sz w:val="23"/>
+          <w:szCs w:val="23"/>
+          <w:rtl/>
+        </w:rPr>
+        <w:t xml:space="preserve">21 ימים (18 ימים לשנה, באופן יחסי לימי העבודה בפועל) × 286.44 ₪, תעריף יום לפי התלוש, ובסה"כ </w:t>
+      </w:r>
+      <w:r>
+        <w:rPr>
+          <w:rFonts w:ascii="David" w:cs="David" w:eastAsia="David" w:hAnsi="David"/>
+          <w:b/>
+          <w:bCs/>
+          <w:sz w:val="23"/>
+          <w:szCs w:val="23"/>
+          <w:rtl/>
+        </w:rPr>
+        <w:t xml:space="preserve">6,015 ₪</w:t>
+      </w:r>
+      <w:r>
+        <w:rPr>
+          <w:rFonts w:ascii="David" w:cs="David" w:eastAsia="David" w:hAnsi="David"/>
+          <w:sz w:val="23"/>
+          <w:szCs w:val="23"/>
+          <w:rtl/>
+        </w:rPr>
+        <w:t xml:space="preserve">.</w:t>
       </w:r>
     </w:p>
     <w:p>
@@ -1111,27 +1131,27 @@
           <w:szCs w:val="23"/>
           <w:rtl/>
         </w:rPr>
-        <w:t xml:space="preserve">פדיון חופשה: </w:t>
-      </w:r>
-      <w:r>
-        <w:rPr>
-          <w:rFonts w:ascii="David" w:cs="David" w:eastAsia="David" w:hAnsi="David"/>
-          <w:sz w:val="23"/>
-          <w:szCs w:val="23"/>
-          <w:rtl/>
-        </w:rPr>
-        <w:t xml:space="preserve">21 ימים (18 ימים לשנה, באופן יחסי לימי העבודה בפועל) × 286.44 ₪, תעריף יום לפי התלוש, ובסה"כ </w:t>
-      </w:r>
-      <w:r>
-        <w:rPr>
-          <w:rFonts w:ascii="David" w:cs="David" w:eastAsia="David" w:hAnsi="David"/>
-          <w:b/>
-          <w:bCs/>
-          <w:sz w:val="23"/>
-          <w:szCs w:val="23"/>
-          <w:rtl/>
-        </w:rPr>
-        <w:t xml:space="preserve">6,015 ₪</w:t>
+        <w:t xml:space="preserve">דמי חגים: </w:t>
+      </w:r>
+      <w:r>
+        <w:rPr>
+          <w:rFonts w:ascii="David" w:cs="David" w:eastAsia="David" w:hAnsi="David"/>
+          <w:sz w:val="23"/>
+          <w:szCs w:val="23"/>
+          <w:rtl/>
+        </w:rPr>
+        <w:t xml:space="preserve">9 ימים × 286.44 ₪ = </w:t>
+      </w:r>
+      <w:r>
+        <w:rPr>
+          <w:rFonts w:ascii="David" w:cs="David" w:eastAsia="David" w:hAnsi="David"/>
+          <w:b/>
+          <w:bCs/>
+          <w:sz w:val="23"/>
+          <w:szCs w:val="23"/>
+          <w:rtl/>
+        </w:rPr>
+        <w:t xml:space="preserve">2,578 ₪</w:t>
       </w:r>
       <w:r>
         <w:rPr>
@@ -1163,27 +1183,27 @@
           <w:szCs w:val="23"/>
           <w:rtl/>
         </w:rPr>
-        <w:t xml:space="preserve">דמי חגים: </w:t>
-      </w:r>
-      <w:r>
-        <w:rPr>
-          <w:rFonts w:ascii="David" w:cs="David" w:eastAsia="David" w:hAnsi="David"/>
-          <w:sz w:val="23"/>
-          <w:szCs w:val="23"/>
-          <w:rtl/>
-        </w:rPr>
-        <w:t xml:space="preserve">9 ימים × 286.44 ₪ = </w:t>
-      </w:r>
-      <w:r>
-        <w:rPr>
-          <w:rFonts w:ascii="David" w:cs="David" w:eastAsia="David" w:hAnsi="David"/>
-          <w:b/>
-          <w:bCs/>
-          <w:sz w:val="23"/>
-          <w:szCs w:val="23"/>
-          <w:rtl/>
-        </w:rPr>
-        <w:t xml:space="preserve">2,578 ₪</w:t>
+        <w:t xml:space="preserve">פיצוי לדוגמה: </w:t>
+      </w:r>
+      <w:r>
+        <w:rPr>
+          <w:rFonts w:ascii="David" w:cs="David" w:eastAsia="David" w:hAnsi="David"/>
+          <w:sz w:val="23"/>
+          <w:szCs w:val="23"/>
+          <w:rtl/>
+        </w:rPr>
+        <w:t xml:space="preserve">5,000 ₪ בגין אי-מסירת הודעה על תנאי עבודה ו-5,000 ₪ בגין אי-מסירת תלושי שכר, ובסה"כ </w:t>
+      </w:r>
+      <w:r>
+        <w:rPr>
+          <w:rFonts w:ascii="David" w:cs="David" w:eastAsia="David" w:hAnsi="David"/>
+          <w:b/>
+          <w:bCs/>
+          <w:sz w:val="23"/>
+          <w:szCs w:val="23"/>
+          <w:rtl/>
+        </w:rPr>
+        <w:t xml:space="preserve">10,000 ₪</w:t>
       </w:r>
       <w:r>
         <w:rPr>
@@ -1209,162 +1229,6 @@
       <w:r>
         <w:rPr>
           <w:rFonts w:ascii="David" w:cs="David" w:eastAsia="David" w:hAnsi="David"/>
-          <w:b/>
-          <w:bCs/>
-          <w:sz w:val="23"/>
-          <w:szCs w:val="23"/>
-          <w:rtl/>
-        </w:rPr>
-        <w:t xml:space="preserve">דמי מחלה: </w:t>
-      </w:r>
-      <w:r>
-        <w:rPr>
-          <w:rFonts w:ascii="David" w:cs="David" w:eastAsia="David" w:hAnsi="David"/>
-          <w:sz w:val="23"/>
-          <w:szCs w:val="23"/>
-          <w:rtl/>
-        </w:rPr>
-        <w:t xml:space="preserve">על דרך האומדן, 10 ימי היעדרות בשתי תקופות מחלה, השווים ל-6 ימי תשלום לפי סעיף 2 לחוק דמי מחלה × 286.44 ₪ = </w:t>
-      </w:r>
-      <w:r>
-        <w:rPr>
-          <w:rFonts w:ascii="David" w:cs="David" w:eastAsia="David" w:hAnsi="David"/>
-          <w:b/>
-          <w:bCs/>
-          <w:sz w:val="23"/>
-          <w:szCs w:val="23"/>
-          <w:rtl/>
-        </w:rPr>
-        <w:t xml:space="preserve">1,719 ₪</w:t>
-      </w:r>
-      <w:r>
-        <w:rPr>
-          <w:rFonts w:ascii="David" w:cs="David" w:eastAsia="David" w:hAnsi="David"/>
-          <w:sz w:val="23"/>
-          <w:szCs w:val="23"/>
-          <w:rtl/>
-        </w:rPr>
-        <w:t xml:space="preserve">.</w:t>
-      </w:r>
-    </w:p>
-    <w:p>
-      <w:pPr>
-        <w:pStyle w:val="ListParagraph"/>
-        <w:numPr>
-          <w:ilvl w:val="0"/>
-          <w:numId w:val="2"/>
-        </w:numPr>
-        <w:bidi/>
-        <w:spacing w:after="100" w:before="0" w:line="276" w:lineRule="auto"/>
-        <w:jc w:val="both"/>
-      </w:pPr>
-      <w:r>
-        <w:rPr>
-          <w:rFonts w:ascii="David" w:cs="David" w:eastAsia="David" w:hAnsi="David"/>
-          <w:b/>
-          <w:bCs/>
-          <w:sz w:val="23"/>
-          <w:szCs w:val="23"/>
-          <w:rtl/>
-        </w:rPr>
-        <w:t xml:space="preserve">שכר חודש 9/2024: </w:t>
-      </w:r>
-      <w:r>
-        <w:rPr>
-          <w:rFonts w:ascii="David" w:cs="David" w:eastAsia="David" w:hAnsi="David"/>
-          <w:sz w:val="23"/>
-          <w:szCs w:val="23"/>
-          <w:rtl/>
-        </w:rPr>
-        <w:t xml:space="preserve">בהעדר תלוש ורישום, לפי השכר הקובע = </w:t>
-      </w:r>
-      <w:r>
-        <w:rPr>
-          <w:rFonts w:ascii="David" w:cs="David" w:eastAsia="David" w:hAnsi="David"/>
-          <w:b/>
-          <w:bCs/>
-          <w:sz w:val="23"/>
-          <w:szCs w:val="23"/>
-          <w:rtl/>
-        </w:rPr>
-        <w:t xml:space="preserve">3,500 ₪</w:t>
-      </w:r>
-      <w:r>
-        <w:rPr>
-          <w:rFonts w:ascii="David" w:cs="David" w:eastAsia="David" w:hAnsi="David"/>
-          <w:sz w:val="23"/>
-          <w:szCs w:val="23"/>
-          <w:rtl/>
-        </w:rPr>
-        <w:t xml:space="preserve">.</w:t>
-      </w:r>
-    </w:p>
-    <w:p>
-      <w:pPr>
-        <w:pStyle w:val="ListParagraph"/>
-        <w:numPr>
-          <w:ilvl w:val="0"/>
-          <w:numId w:val="2"/>
-        </w:numPr>
-        <w:bidi/>
-        <w:spacing w:after="100" w:before="0" w:line="276" w:lineRule="auto"/>
-        <w:jc w:val="both"/>
-      </w:pPr>
-      <w:r>
-        <w:rPr>
-          <w:rFonts w:ascii="David" w:cs="David" w:eastAsia="David" w:hAnsi="David"/>
-          <w:b/>
-          <w:bCs/>
-          <w:sz w:val="23"/>
-          <w:szCs w:val="23"/>
-          <w:rtl/>
-        </w:rPr>
-        <w:t xml:space="preserve">פיצוי לדוגמה: </w:t>
-      </w:r>
-      <w:r>
-        <w:rPr>
-          <w:rFonts w:ascii="David" w:cs="David" w:eastAsia="David" w:hAnsi="David"/>
-          <w:sz w:val="23"/>
-          <w:szCs w:val="23"/>
-          <w:rtl/>
-        </w:rPr>
-        <w:t xml:space="preserve">5,000 ₪ בגין אי-מסירת הודעה על תנאי עבודה ו-5,000 ₪ בגין אי-מסירת תלושי שכר, ובסה"כ </w:t>
-      </w:r>
-      <w:r>
-        <w:rPr>
-          <w:rFonts w:ascii="David" w:cs="David" w:eastAsia="David" w:hAnsi="David"/>
-          <w:b/>
-          <w:bCs/>
-          <w:sz w:val="23"/>
-          <w:szCs w:val="23"/>
-          <w:rtl/>
-        </w:rPr>
-        <w:t xml:space="preserve">10,000 ₪</w:t>
-      </w:r>
-      <w:r>
-        <w:rPr>
-          <w:rFonts w:ascii="David" w:cs="David" w:eastAsia="David" w:hAnsi="David"/>
-          <w:sz w:val="23"/>
-          <w:szCs w:val="23"/>
-          <w:rtl/>
-        </w:rPr>
-        <w:t xml:space="preserve">.</w:t>
-      </w:r>
-    </w:p>
-    <w:p>
-      <w:pPr>
-        <w:pStyle w:val="ListParagraph"/>
-        <w:numPr>
-          <w:ilvl w:val="0"/>
-          <w:numId w:val="2"/>
-        </w:numPr>
-        <w:bidi/>
-        <w:spacing w:after="100" w:before="0" w:line="276" w:lineRule="auto"/>
-        <w:jc w:val="both"/>
-      </w:pPr>
-      <w:r>
-        <w:rPr>
-          <w:rFonts w:ascii="David" w:cs="David" w:eastAsia="David" w:hAnsi="David"/>
           <w:sz w:val="23"/>
           <w:szCs w:val="23"/>
           <w:rtl/>
@@ -1380,7 +1244,7 @@
           <w:szCs w:val="23"/>
           <w:rtl/>
         </w:rPr>
-        <w:t xml:space="preserve">70,090 ₪</w:t>
+        <w:t xml:space="preserve">52,226 ₪</w:t>
       </w:r>
       <w:r>
         <w:rPr>

</xml_diff>

<commit_message>
Reword summary clause: full claim 52,226 ILS, filed at 50,000 ILS for fee purposes
Co-Authored-By: Claude Fable 5.1 <noreply@anthropic.com>
Claude-Session: https://claude.ai/code/session_01LZZvntJ3pJMoHrEfkbpmK5
</commit_message>
<xml_diff>
--- a/labor-claim-omer-almo/כתב_תביעה_עומר_אלמו.docx
+++ b/labor-claim-omer-almo/כתב_תביעה_עומר_אלמו.docx
@@ -505,7 +505,7 @@
           <w:szCs w:val="23"/>
           <w:rtl/>
         </w:rPr>
-        <w:t xml:space="preserve">52,226 ₪.</w:t>
+        <w:t xml:space="preserve">52,226 ₪ (לצורכי אגרה: 50,000 ₪).</w:t>
       </w:r>
     </w:p>
     <w:p>
@@ -1229,11 +1229,22 @@
       <w:r>
         <w:rPr>
           <w:rFonts w:ascii="David" w:cs="David" w:eastAsia="David" w:hAnsi="David"/>
-          <w:sz w:val="23"/>
-          <w:szCs w:val="23"/>
-          <w:rtl/>
-        </w:rPr>
-        <w:t xml:space="preserve">סך הכל על הנתבעת לשלם לתובע </w:t>
+          <w:b/>
+          <w:bCs/>
+          <w:sz w:val="23"/>
+          <w:szCs w:val="23"/>
+          <w:rtl/>
+        </w:rPr>
+        <w:t xml:space="preserve">סיכום. </w:t>
+      </w:r>
+      <w:r>
+        <w:rPr>
+          <w:rFonts w:ascii="David" w:cs="David" w:eastAsia="David" w:hAnsi="David"/>
+          <w:sz w:val="23"/>
+          <w:szCs w:val="23"/>
+          <w:rtl/>
+        </w:rPr>
+        <w:t xml:space="preserve">על הנתבעת לשלם לתובע את הסך </w:t>
       </w:r>
       <w:r>
         <w:rPr>
@@ -1253,7 +1264,27 @@
           <w:szCs w:val="23"/>
           <w:rtl/>
         </w:rPr>
-        <w:t xml:space="preserve">, בצירוף הפרשי הצמדה וריבית כחוק ממועד סיום העבודה ועד התשלום בפועל. לחלופין, ובכפוף לשיקול דעת בית הדין הנכבד, בצירוף פיצויי הלנת שכר והלנת פיצויי פיטורים לפי חוק הגנת השכר.</w:t>
+        <w:t xml:space="preserve"> בצירוף פיצויי הלנת שכר ופיצויי הלנת פיצויי פיטורים. לחלופין, בצירוף הפרשי הצמדה וריבית מקסימלית כחוק. לצורכי אגרה בלבד, ולאור מצבו הכלכלי של התובע, התביעה מוגשת אך על הסך של </w:t>
+      </w:r>
+      <w:r>
+        <w:rPr>
+          <w:rFonts w:ascii="David" w:cs="David" w:eastAsia="David" w:hAnsi="David"/>
+          <w:b/>
+          <w:bCs/>
+          <w:sz w:val="23"/>
+          <w:szCs w:val="23"/>
+          <w:rtl/>
+        </w:rPr>
+        <w:t xml:space="preserve">50,000 ₪</w:t>
+      </w:r>
+      <w:r>
+        <w:rPr>
+          <w:rFonts w:ascii="David" w:cs="David" w:eastAsia="David" w:hAnsi="David"/>
+          <w:sz w:val="23"/>
+          <w:szCs w:val="23"/>
+          <w:rtl/>
+        </w:rPr>
+        <w:t xml:space="preserve">, כאשר התובע שומר לעצמו את הזכות לשלם הפרשי אגרה ולהעמיד את התביעה על סכומה המקורי הנ"ל.</w:t>
       </w:r>
     </w:p>
     <w:p>

</xml_diff>

<commit_message>
Restructure Omer Almo claim: no sub-headings, short numbered clauses, fee-basis summary
Co-Authored-By: Claude Fable 5.1 <noreply@anthropic.com>
Claude-Session: https://claude.ai/code/session_01LZZvntJ3pJMoHrEfkbpmK5
</commit_message>
<xml_diff>
--- a/labor-claim-omer-almo/כתב_תביעה_עומר_אלמו.docx
+++ b/labor-claim-omer-almo/כתב_תביעה_עומר_אלמו.docx
@@ -556,10 +556,24 @@
     </w:p>
     <w:p>
       <w:pPr>
-        <w:bidi/>
-        <w:spacing w:after="60" w:before="0" w:line="276" w:lineRule="auto"/>
-        <w:jc w:val="start"/>
-      </w:pPr>
+        <w:pStyle w:val="ListParagraph"/>
+        <w:numPr>
+          <w:ilvl w:val="0"/>
+          <w:numId w:val="2"/>
+        </w:numPr>
+        <w:bidi/>
+        <w:spacing w:after="70" w:before="0" w:line="276" w:lineRule="auto"/>
+        <w:jc w:val="both"/>
+      </w:pPr>
+      <w:r>
+        <w:rPr>
+          <w:rFonts w:ascii="David" w:cs="David" w:eastAsia="David" w:hAnsi="David"/>
+          <w:sz w:val="23"/>
+          <w:szCs w:val="23"/>
+          <w:rtl/>
+        </w:rPr>
+        <w:t xml:space="preserve">התובע, יליד 16.5.2006, הועסק על ידי הנתבעת, חברה להפקת אירועים, כמלצר באירועים, ברציפות מיום </w:t>
+      </w:r>
       <w:r>
         <w:rPr>
           <w:rFonts w:ascii="David" w:cs="David" w:eastAsia="David" w:hAnsi="David"/>
@@ -567,31 +581,18 @@
           <w:bCs/>
           <w:sz w:val="23"/>
           <w:szCs w:val="23"/>
-          <w:u w:val="single"/>
-          <w:rtl/>
-        </w:rPr>
-        <w:t xml:space="preserve">א. הצדדים ותקופת העבודה</w:t>
-      </w:r>
-    </w:p>
-    <w:p>
-      <w:pPr>
-        <w:pStyle w:val="ListParagraph"/>
-        <w:numPr>
-          <w:ilvl w:val="0"/>
-          <w:numId w:val="2"/>
-        </w:numPr>
-        <w:bidi/>
-        <w:spacing w:after="100" w:before="0" w:line="276" w:lineRule="auto"/>
-        <w:jc w:val="both"/>
-      </w:pPr>
-      <w:r>
-        <w:rPr>
-          <w:rFonts w:ascii="David" w:cs="David" w:eastAsia="David" w:hAnsi="David"/>
-          <w:sz w:val="23"/>
-          <w:szCs w:val="23"/>
-          <w:rtl/>
-        </w:rPr>
-        <w:t xml:space="preserve">התובע, יליד </w:t>
+          <w:rtl/>
+        </w:rPr>
+        <w:t xml:space="preserve">01.05.2022</w:t>
+      </w:r>
+      <w:r>
+        <w:rPr>
+          <w:rFonts w:ascii="David" w:cs="David" w:eastAsia="David" w:hAnsi="David"/>
+          <w:sz w:val="23"/>
+          <w:szCs w:val="23"/>
+          <w:rtl/>
+        </w:rPr>
+        <w:t xml:space="preserve"> ועד ליום </w:t>
       </w:r>
       <w:r>
         <w:rPr>
@@ -602,16 +603,79 @@
           <w:szCs w:val="23"/>
           <w:rtl/>
         </w:rPr>
-        <w:t xml:space="preserve">16.5.2006</w:t>
-      </w:r>
-      <w:r>
-        <w:rPr>
-          <w:rFonts w:ascii="David" w:cs="David" w:eastAsia="David" w:hAnsi="David"/>
-          <w:sz w:val="23"/>
-          <w:szCs w:val="23"/>
-          <w:rtl/>
-        </w:rPr>
-        <w:t xml:space="preserve">, הועסק על ידי הנתבעת, חברה להפקת אירועים, כמלצר באירועים, ברציפות מיום </w:t>
+        <w:t xml:space="preserve">28.9.2024</w:t>
+      </w:r>
+      <w:r>
+        <w:rPr>
+          <w:rFonts w:ascii="David" w:cs="David" w:eastAsia="David" w:hAnsi="David"/>
+          <w:sz w:val="23"/>
+          <w:szCs w:val="23"/>
+          <w:rtl/>
+        </w:rPr>
+        <w:t xml:space="preserve">, שנתיים וחמישה חודשים. תלושי השכר מצורפים כנספח א'.</w:t>
+      </w:r>
+    </w:p>
+    <w:p>
+      <w:pPr>
+        <w:pStyle w:val="ListParagraph"/>
+        <w:numPr>
+          <w:ilvl w:val="0"/>
+          <w:numId w:val="2"/>
+        </w:numPr>
+        <w:bidi/>
+        <w:spacing w:after="70" w:before="0" w:line="276" w:lineRule="auto"/>
+        <w:jc w:val="both"/>
+      </w:pPr>
+      <w:r>
+        <w:rPr>
+          <w:rFonts w:ascii="David" w:cs="David" w:eastAsia="David" w:hAnsi="David"/>
+          <w:sz w:val="23"/>
+          <w:szCs w:val="23"/>
+          <w:rtl/>
+        </w:rPr>
+        <w:t xml:space="preserve">במרבית תקופת העבודה היה התובע קטין, והעסקתו כפופה להוראות חוק עבודת הנוער, התשי"ג-1953.</w:t>
+      </w:r>
+    </w:p>
+    <w:p>
+      <w:pPr>
+        <w:pStyle w:val="ListParagraph"/>
+        <w:numPr>
+          <w:ilvl w:val="0"/>
+          <w:numId w:val="2"/>
+        </w:numPr>
+        <w:bidi/>
+        <w:spacing w:after="70" w:before="0" w:line="276" w:lineRule="auto"/>
+        <w:jc w:val="both"/>
+      </w:pPr>
+      <w:r>
+        <w:rPr>
+          <w:rFonts w:ascii="David" w:cs="David" w:eastAsia="David" w:hAnsi="David"/>
+          <w:sz w:val="23"/>
+          <w:szCs w:val="23"/>
+          <w:rtl/>
+        </w:rPr>
+        <w:t xml:space="preserve">שכרו של התובע שולם לפי תעריף שעתי (30 ₪, ומשנת 2024 32.33 ₪) בתוספת תשלום קבוע למשמרת אירוע (250-300 ₪).</w:t>
+      </w:r>
+    </w:p>
+    <w:p>
+      <w:pPr>
+        <w:pStyle w:val="ListParagraph"/>
+        <w:numPr>
+          <w:ilvl w:val="0"/>
+          <w:numId w:val="2"/>
+        </w:numPr>
+        <w:bidi/>
+        <w:spacing w:after="70" w:before="0" w:line="276" w:lineRule="auto"/>
+        <w:jc w:val="both"/>
+      </w:pPr>
+      <w:r>
+        <w:rPr>
+          <w:rFonts w:ascii="David" w:cs="David" w:eastAsia="David" w:hAnsi="David"/>
+          <w:sz w:val="23"/>
+          <w:szCs w:val="23"/>
+          <w:rtl/>
+        </w:rPr>
+        <w:t xml:space="preserve">שכרו הממוצע של התובע בשנים-עשר חודשי העבודה האחרונים, בנטרול דמי הבראה, עמד על </w:t>
       </w:r>
       <w:r>
         <w:rPr>
@@ -622,16 +686,247 @@
           <w:szCs w:val="23"/>
           <w:rtl/>
         </w:rPr>
-        <w:t xml:space="preserve">01.05.2022</w:t>
-      </w:r>
-      <w:r>
-        <w:rPr>
-          <w:rFonts w:ascii="David" w:cs="David" w:eastAsia="David" w:hAnsi="David"/>
-          <w:sz w:val="23"/>
-          <w:szCs w:val="23"/>
-          <w:rtl/>
-        </w:rPr>
-        <w:t xml:space="preserve"> ועד ליום </w:t>
+        <w:t xml:space="preserve">3,500 ₪</w:t>
+      </w:r>
+      <w:r>
+        <w:rPr>
+          <w:rFonts w:ascii="David" w:cs="David" w:eastAsia="David" w:hAnsi="David"/>
+          <w:sz w:val="23"/>
+          <w:szCs w:val="23"/>
+          <w:rtl/>
+        </w:rPr>
+        <w:t xml:space="preserve"> לחודש (להלן: "השכר הקובע").</w:t>
+      </w:r>
+    </w:p>
+    <w:p>
+      <w:pPr>
+        <w:pStyle w:val="ListParagraph"/>
+        <w:numPr>
+          <w:ilvl w:val="0"/>
+          <w:numId w:val="2"/>
+        </w:numPr>
+        <w:bidi/>
+        <w:spacing w:after="70" w:before="0" w:line="276" w:lineRule="auto"/>
+        <w:jc w:val="both"/>
+      </w:pPr>
+      <w:r>
+        <w:rPr>
+          <w:rFonts w:ascii="David" w:cs="David" w:eastAsia="David" w:hAnsi="David"/>
+          <w:sz w:val="23"/>
+          <w:szCs w:val="23"/>
+          <w:rtl/>
+        </w:rPr>
+        <w:t xml:space="preserve">העסקת התובע הסתיימה ביום 28.9.2024 עקב גיוסו לשירות סדיר בצה"ל. התפטרות עקב גיוס דינה כפיטורים לעניין פיצויי פיטורים, מכוח סעיף 11(ג) לחוק פיצויי פיטורים, התשכ"ג-1963.</w:t>
+      </w:r>
+    </w:p>
+    <w:p>
+      <w:pPr>
+        <w:pStyle w:val="ListParagraph"/>
+        <w:numPr>
+          <w:ilvl w:val="0"/>
+          <w:numId w:val="2"/>
+        </w:numPr>
+        <w:bidi/>
+        <w:spacing w:after="70" w:before="0" w:line="276" w:lineRule="auto"/>
+        <w:jc w:val="both"/>
+      </w:pPr>
+      <w:r>
+        <w:rPr>
+          <w:rFonts w:ascii="David" w:cs="David" w:eastAsia="David" w:hAnsi="David"/>
+          <w:sz w:val="23"/>
+          <w:szCs w:val="23"/>
+          <w:rtl/>
+        </w:rPr>
+        <w:t xml:space="preserve">הנתבעת לא ערכה לתובע גמר חשבון ולא שילמה לו דבר בגין זכויותיו. פניות התובע אליה נענו בהתעלמות מוחלטת.</w:t>
+      </w:r>
+    </w:p>
+    <w:p>
+      <w:pPr>
+        <w:pStyle w:val="ListParagraph"/>
+        <w:numPr>
+          <w:ilvl w:val="0"/>
+          <w:numId w:val="2"/>
+        </w:numPr>
+        <w:bidi/>
+        <w:spacing w:after="70" w:before="0" w:line="276" w:lineRule="auto"/>
+        <w:jc w:val="both"/>
+      </w:pPr>
+      <w:r>
+        <w:rPr>
+          <w:rFonts w:ascii="David" w:cs="David" w:eastAsia="David" w:hAnsi="David"/>
+          <w:sz w:val="23"/>
+          <w:szCs w:val="23"/>
+          <w:rtl/>
+        </w:rPr>
+        <w:t xml:space="preserve">ביום 13.7.2026 שלח ב"כ התובע לנתבעת מכתב התראה בדואר רשום (נספח ב'). הנתבעת לא השיבה ולא שילמה. תלושי השכר הופקו לראשונה ביום 3.8.2026, כעולה מגוף התלושים עצמם.</w:t>
+      </w:r>
+    </w:p>
+    <w:p>
+      <w:pPr>
+        <w:pStyle w:val="ListParagraph"/>
+        <w:numPr>
+          <w:ilvl w:val="0"/>
+          <w:numId w:val="2"/>
+        </w:numPr>
+        <w:bidi/>
+        <w:spacing w:after="70" w:before="0" w:line="276" w:lineRule="auto"/>
+        <w:jc w:val="both"/>
+      </w:pPr>
+      <w:r>
+        <w:rPr>
+          <w:rFonts w:ascii="David" w:cs="David" w:eastAsia="David" w:hAnsi="David"/>
+          <w:sz w:val="23"/>
+          <w:szCs w:val="23"/>
+          <w:rtl/>
+        </w:rPr>
+        <w:t xml:space="preserve">מרישומי הנתבעת עצמה עולה כי התובע הועסק דרך קבע במשמרות שחרגו משמונה שעות, ובחלק מהחודשים (5-6/2023, 12/2023, 1/2024) במשמרות של 12-13 שעות בממוצע. בפועל הועסק התובע במשמרות בנות 11-13 שעות.</w:t>
+      </w:r>
+    </w:p>
+    <w:p>
+      <w:pPr>
+        <w:pStyle w:val="ListParagraph"/>
+        <w:numPr>
+          <w:ilvl w:val="0"/>
+          <w:numId w:val="2"/>
+        </w:numPr>
+        <w:bidi/>
+        <w:spacing w:after="70" w:before="0" w:line="276" w:lineRule="auto"/>
+        <w:jc w:val="both"/>
+      </w:pPr>
+      <w:r>
+        <w:rPr>
+          <w:rFonts w:ascii="David" w:cs="David" w:eastAsia="David" w:hAnsi="David"/>
+          <w:sz w:val="23"/>
+          <w:szCs w:val="23"/>
+          <w:rtl/>
+        </w:rPr>
+        <w:t xml:space="preserve">סעיף 20 לחוק עבודת הנוער אוסר להעסיק נער מעבר לשמונה שעות ביום, וסעיף 16 לחוק שעות עבודה ומנוחה, התשי"א-1951, מחייב גמול של 125% ו-150%. הנתבעת לא שילמה גמול כלשהו.</w:t>
+      </w:r>
+    </w:p>
+    <w:p>
+      <w:pPr>
+        <w:pStyle w:val="ListParagraph"/>
+        <w:numPr>
+          <w:ilvl w:val="0"/>
+          <w:numId w:val="2"/>
+        </w:numPr>
+        <w:bidi/>
+        <w:spacing w:after="70" w:before="0" w:line="276" w:lineRule="auto"/>
+        <w:jc w:val="both"/>
+      </w:pPr>
+      <w:r>
+        <w:rPr>
+          <w:rFonts w:ascii="David" w:cs="David" w:eastAsia="David" w:hAnsi="David"/>
+          <w:sz w:val="23"/>
+          <w:szCs w:val="23"/>
+          <w:rtl/>
+        </w:rPr>
+        <w:t xml:space="preserve">הנתבעת לא ניהלה פנקס שעות כדין, ומכוח סעיף 26ב לחוק הגנת השכר, התשי"ח-1958, נטל ההוכחה בעניין היקף השעות מוטל עליה.</w:t>
+      </w:r>
+    </w:p>
+    <w:p>
+      <w:pPr>
+        <w:pStyle w:val="ListParagraph"/>
+        <w:numPr>
+          <w:ilvl w:val="0"/>
+          <w:numId w:val="2"/>
+        </w:numPr>
+        <w:bidi/>
+        <w:spacing w:after="70" w:before="0" w:line="276" w:lineRule="auto"/>
+        <w:jc w:val="both"/>
+      </w:pPr>
+      <w:r>
+        <w:rPr>
+          <w:rFonts w:ascii="David" w:cs="David" w:eastAsia="David" w:hAnsi="David"/>
+          <w:sz w:val="23"/>
+          <w:szCs w:val="23"/>
+          <w:rtl/>
+        </w:rPr>
+        <w:t xml:space="preserve">פיצויי פיטורים לא שולמו לתובע כלל, אף שהועסק למעלה משנתיים וסיום עבודתו מזכה בפיצויים מכוח החוק.</w:t>
+      </w:r>
+    </w:p>
+    <w:p>
+      <w:pPr>
+        <w:pStyle w:val="ListParagraph"/>
+        <w:numPr>
+          <w:ilvl w:val="0"/>
+          <w:numId w:val="2"/>
+        </w:numPr>
+        <w:bidi/>
+        <w:spacing w:after="70" w:before="0" w:line="276" w:lineRule="auto"/>
+        <w:jc w:val="both"/>
+      </w:pPr>
+      <w:r>
+        <w:rPr>
+          <w:rFonts w:ascii="David" w:cs="David" w:eastAsia="David" w:hAnsi="David"/>
+          <w:sz w:val="23"/>
+          <w:szCs w:val="23"/>
+          <w:rtl/>
+        </w:rPr>
+        <w:t xml:space="preserve">נער זכאי ל-18 ימי חופשה בשנה (סעיף 27 לחוק עבודת הנוער). תלוש השכר האחרון, לחודש 8/2024, מודה ביתרה של 15.26 ימים בלתי מנוצלים, ואף היא לא נפדתה, בניגוד לסעיף 13 לחוק חופשה שנתית, התשי"א-1951.</w:t>
+      </w:r>
+    </w:p>
+    <w:p>
+      <w:pPr>
+        <w:pStyle w:val="ListParagraph"/>
+        <w:numPr>
+          <w:ilvl w:val="0"/>
+          <w:numId w:val="2"/>
+        </w:numPr>
+        <w:bidi/>
+        <w:spacing w:after="70" w:before="0" w:line="276" w:lineRule="auto"/>
+        <w:jc w:val="both"/>
+      </w:pPr>
+      <w:r>
+        <w:rPr>
+          <w:rFonts w:ascii="David" w:cs="David" w:eastAsia="David" w:hAnsi="David"/>
+          <w:sz w:val="23"/>
+          <w:szCs w:val="23"/>
+          <w:rtl/>
+        </w:rPr>
+        <w:t xml:space="preserve">כעובד שעתי בעל ותק העולה על שלושה חודשים זכאי היה התובע לתשעה ימי חג בשנה מכוח צו ההרחבה הכללי במשק (הסכם המסגרת משנת 2000). לא שולם דבר.</w:t>
+      </w:r>
+    </w:p>
+    <w:p>
+      <w:pPr>
+        <w:pStyle w:val="ListParagraph"/>
+        <w:numPr>
+          <w:ilvl w:val="0"/>
+          <w:numId w:val="2"/>
+        </w:numPr>
+        <w:bidi/>
+        <w:spacing w:after="70" w:before="0" w:line="276" w:lineRule="auto"/>
+        <w:jc w:val="both"/>
+      </w:pPr>
+      <w:r>
+        <w:rPr>
+          <w:rFonts w:ascii="David" w:cs="David" w:eastAsia="David" w:hAnsi="David"/>
+          <w:sz w:val="23"/>
+          <w:szCs w:val="23"/>
+          <w:rtl/>
+        </w:rPr>
+        <w:t xml:space="preserve">לא נמסרה לתובע הודעה על תנאי עבודתו, בניגוד לחוק הודעה לעובד ולמועמד לעבודה, התשס"ב-2002, ותלושי השכר לא נמסרו לו במועדם, בניגוד לסעיף 24 לחוק הגנת השכר. כל אחת מההפרות מקימה זכות לפיצוי לדוגמה ללא הוכחת נזק.</w:t>
+      </w:r>
+    </w:p>
+    <w:p>
+      <w:pPr>
+        <w:pStyle w:val="ListParagraph"/>
+        <w:numPr>
+          <w:ilvl w:val="0"/>
+          <w:numId w:val="2"/>
+        </w:numPr>
+        <w:bidi/>
+        <w:spacing w:after="70" w:before="0" w:line="276" w:lineRule="auto"/>
+        <w:jc w:val="both"/>
+      </w:pPr>
+      <w:r>
+        <w:rPr>
+          <w:rFonts w:ascii="David" w:cs="David" w:eastAsia="David" w:hAnsi="David"/>
+          <w:sz w:val="23"/>
+          <w:szCs w:val="23"/>
+          <w:rtl/>
+        </w:rPr>
+        <w:t xml:space="preserve">התובע זכאי לפיצויי פיטורים בסך </w:t>
       </w:r>
       <w:r>
         <w:rPr>
@@ -642,37 +937,37 @@
           <w:szCs w:val="23"/>
           <w:rtl/>
         </w:rPr>
-        <w:t xml:space="preserve">28.9.2024</w:t>
-      </w:r>
-      <w:r>
-        <w:rPr>
-          <w:rFonts w:ascii="David" w:cs="David" w:eastAsia="David" w:hAnsi="David"/>
-          <w:sz w:val="23"/>
-          <w:szCs w:val="23"/>
-          <w:rtl/>
-        </w:rPr>
-        <w:t xml:space="preserve">, שנתיים וחמישה חודשים. במרבית תקופת העבודה היה התובע קטין, והעסקתו כפופה להוראות חוק עבודת הנוער, התשי"ג-1953. תלושי השכר מצורפים כנספח א'.</w:t>
-      </w:r>
-    </w:p>
-    <w:p>
-      <w:pPr>
-        <w:pStyle w:val="ListParagraph"/>
-        <w:numPr>
-          <w:ilvl w:val="0"/>
-          <w:numId w:val="2"/>
-        </w:numPr>
-        <w:bidi/>
-        <w:spacing w:after="100" w:before="0" w:line="276" w:lineRule="auto"/>
-        <w:jc w:val="both"/>
-      </w:pPr>
-      <w:r>
-        <w:rPr>
-          <w:rFonts w:ascii="David" w:cs="David" w:eastAsia="David" w:hAnsi="David"/>
-          <w:sz w:val="23"/>
-          <w:szCs w:val="23"/>
-          <w:rtl/>
-        </w:rPr>
-        <w:t xml:space="preserve">שכרו של התובע שולם לפי תעריף שעתי (30 ₪, ומשנת 2024 32.33 ₪) בתוספת תשלום קבוע למשמרת אירוע (250-300 ₪). שכרו הממוצע בשנים-עשר חודשי העבודה האחרונים, בנטרול דמי הבראה, עמד על </w:t>
+        <w:t xml:space="preserve">8,458 ₪</w:t>
+      </w:r>
+      <w:r>
+        <w:rPr>
+          <w:rFonts w:ascii="David" w:cs="David" w:eastAsia="David" w:hAnsi="David"/>
+          <w:sz w:val="23"/>
+          <w:szCs w:val="23"/>
+          <w:rtl/>
+        </w:rPr>
+        <w:t xml:space="preserve">, לפי 3,500 ₪ × 29/12 חודשי עבודה.</w:t>
+      </w:r>
+    </w:p>
+    <w:p>
+      <w:pPr>
+        <w:pStyle w:val="ListParagraph"/>
+        <w:numPr>
+          <w:ilvl w:val="0"/>
+          <w:numId w:val="2"/>
+        </w:numPr>
+        <w:bidi/>
+        <w:spacing w:after="70" w:before="0" w:line="276" w:lineRule="auto"/>
+        <w:jc w:val="both"/>
+      </w:pPr>
+      <w:r>
+        <w:rPr>
+          <w:rFonts w:ascii="David" w:cs="David" w:eastAsia="David" w:hAnsi="David"/>
+          <w:sz w:val="23"/>
+          <w:szCs w:val="23"/>
+          <w:rtl/>
+        </w:rPr>
+        <w:t xml:space="preserve">התובע זכאי לגמול שעות נוספות בסך </w:t>
       </w:r>
       <w:r>
         <w:rPr>
@@ -683,58 +978,58 @@
           <w:szCs w:val="23"/>
           <w:rtl/>
         </w:rPr>
-        <w:t xml:space="preserve">3,500 ₪</w:t>
-      </w:r>
-      <w:r>
-        <w:rPr>
-          <w:rFonts w:ascii="David" w:cs="David" w:eastAsia="David" w:hAnsi="David"/>
-          <w:sz w:val="23"/>
-          <w:szCs w:val="23"/>
-          <w:rtl/>
-        </w:rPr>
-        <w:t xml:space="preserve"> לחודש (להלן: "השכר הקובע").</w:t>
-      </w:r>
-    </w:p>
-    <w:p>
-      <w:pPr>
-        <w:pStyle w:val="ListParagraph"/>
-        <w:numPr>
-          <w:ilvl w:val="0"/>
-          <w:numId w:val="2"/>
-        </w:numPr>
-        <w:bidi/>
-        <w:spacing w:after="100" w:before="0" w:line="276" w:lineRule="auto"/>
-        <w:jc w:val="both"/>
-      </w:pPr>
-      <w:r>
-        <w:rPr>
-          <w:rFonts w:ascii="David" w:cs="David" w:eastAsia="David" w:hAnsi="David"/>
-          <w:sz w:val="23"/>
-          <w:szCs w:val="23"/>
-          <w:rtl/>
-        </w:rPr>
-        <w:t xml:space="preserve">העסקת התובע הסתיימה ביום 28.9.2024 עקב גיוסו לשירות סדיר בצה"ל. התפטרות עקב גיוס דינה כפיטורים לעניין פיצויי פיטורים, מכוח סעיף 11(ג) לחוק פיצויי פיטורים, התשכ"ג-1963. הנתבעת לא ערכה לתובע גמר חשבון ולא שילמה לו דבר בגין זכויותיו.</w:t>
-      </w:r>
-    </w:p>
-    <w:p>
-      <w:pPr>
-        <w:pStyle w:val="ListParagraph"/>
-        <w:numPr>
-          <w:ilvl w:val="0"/>
-          <w:numId w:val="2"/>
-        </w:numPr>
-        <w:bidi/>
-        <w:spacing w:after="100" w:before="0" w:line="276" w:lineRule="auto"/>
-        <w:jc w:val="both"/>
-      </w:pPr>
-      <w:r>
-        <w:rPr>
-          <w:rFonts w:ascii="David" w:cs="David" w:eastAsia="David" w:hAnsi="David"/>
-          <w:sz w:val="23"/>
-          <w:szCs w:val="23"/>
-          <w:rtl/>
-        </w:rPr>
-        <w:t xml:space="preserve">פניות התובע לנתבעת נענו בהתעלמות מוחלטת. ביום </w:t>
+        <w:t xml:space="preserve">25,175 ₪</w:t>
+      </w:r>
+      <w:r>
+        <w:rPr>
+          <w:rFonts w:ascii="David" w:cs="David" w:eastAsia="David" w:hAnsi="David"/>
+          <w:sz w:val="23"/>
+          <w:szCs w:val="23"/>
+          <w:rtl/>
+        </w:rPr>
+        <w:t xml:space="preserve">: 281 משמרות × 3 שעות נוספות למשמרת (שתיים ב-125% ואחת ב-150%, 120 ₪ למשמרת לפי 30 ₪ לשעה) = 33,720 ₪, בניכוי 8,545 ₪ ששולמו כשכר יסוד שעתי.</w:t>
+      </w:r>
+    </w:p>
+    <w:p>
+      <w:pPr>
+        <w:pStyle w:val="ListParagraph"/>
+        <w:numPr>
+          <w:ilvl w:val="0"/>
+          <w:numId w:val="2"/>
+        </w:numPr>
+        <w:bidi/>
+        <w:spacing w:after="70" w:before="0" w:line="276" w:lineRule="auto"/>
+        <w:jc w:val="both"/>
+      </w:pPr>
+      <w:r>
+        <w:rPr>
+          <w:rFonts w:ascii="David" w:cs="David" w:eastAsia="David" w:hAnsi="David"/>
+          <w:sz w:val="23"/>
+          <w:szCs w:val="23"/>
+          <w:rtl/>
+        </w:rPr>
+        <w:t xml:space="preserve">החישוב נופל מחזקת 15 השעות הנוספות השבועיות שבסעיף 26ב לחוק הגנת השכר. לחלופין, ולכל הפחות, לפי רישומי הנתבעת עצמה: 475 שעות נוספות, ובסה"כ 11,049 ₪.</w:t>
+      </w:r>
+    </w:p>
+    <w:p>
+      <w:pPr>
+        <w:pStyle w:val="ListParagraph"/>
+        <w:numPr>
+          <w:ilvl w:val="0"/>
+          <w:numId w:val="2"/>
+        </w:numPr>
+        <w:bidi/>
+        <w:spacing w:after="70" w:before="0" w:line="276" w:lineRule="auto"/>
+        <w:jc w:val="both"/>
+      </w:pPr>
+      <w:r>
+        <w:rPr>
+          <w:rFonts w:ascii="David" w:cs="David" w:eastAsia="David" w:hAnsi="David"/>
+          <w:sz w:val="23"/>
+          <w:szCs w:val="23"/>
+          <w:rtl/>
+        </w:rPr>
+        <w:t xml:space="preserve">התובע זכאי לפדיון חופשה בסך </w:t>
       </w:r>
       <w:r>
         <w:rPr>
@@ -745,24 +1040,38 @@
           <w:szCs w:val="23"/>
           <w:rtl/>
         </w:rPr>
-        <w:t xml:space="preserve">13.7.2026</w:t>
-      </w:r>
-      <w:r>
-        <w:rPr>
-          <w:rFonts w:ascii="David" w:cs="David" w:eastAsia="David" w:hAnsi="David"/>
-          <w:sz w:val="23"/>
-          <w:szCs w:val="23"/>
-          <w:rtl/>
-        </w:rPr>
-        <w:t xml:space="preserve"> שלח ב"כ התובע לנתבעת מכתב התראה בדואר רשום (נספח ב'). הנתבעת לא השיבה ולא שילמה. תלושי השכר הופקו על ידי הנתבעת לראשונה ביום 3.8.2026, כעולה מהמצוין בגוף התלושים עצמם.</w:t>
-      </w:r>
-    </w:p>
-    <w:p>
-      <w:pPr>
-        <w:bidi/>
-        <w:spacing w:after="60" w:before="60" w:line="276" w:lineRule="auto"/>
-        <w:jc w:val="start"/>
-      </w:pPr>
+        <w:t xml:space="preserve">6,015 ₪</w:t>
+      </w:r>
+      <w:r>
+        <w:rPr>
+          <w:rFonts w:ascii="David" w:cs="David" w:eastAsia="David" w:hAnsi="David"/>
+          <w:sz w:val="23"/>
+          <w:szCs w:val="23"/>
+          <w:rtl/>
+        </w:rPr>
+        <w:t xml:space="preserve">, לפי 21 ימים (18 ימים לשנה, באופן יחסי לימי העבודה בפועל) × 286.44 ₪, תעריף יום לפי התלוש.</w:t>
+      </w:r>
+    </w:p>
+    <w:p>
+      <w:pPr>
+        <w:pStyle w:val="ListParagraph"/>
+        <w:numPr>
+          <w:ilvl w:val="0"/>
+          <w:numId w:val="2"/>
+        </w:numPr>
+        <w:bidi/>
+        <w:spacing w:after="70" w:before="0" w:line="276" w:lineRule="auto"/>
+        <w:jc w:val="both"/>
+      </w:pPr>
+      <w:r>
+        <w:rPr>
+          <w:rFonts w:ascii="David" w:cs="David" w:eastAsia="David" w:hAnsi="David"/>
+          <w:sz w:val="23"/>
+          <w:szCs w:val="23"/>
+          <w:rtl/>
+        </w:rPr>
+        <w:t xml:space="preserve">התובע זכאי לדמי חגים בסך </w:t>
+      </w:r>
       <w:r>
         <w:rPr>
           <w:rFonts w:ascii="David" w:cs="David" w:eastAsia="David" w:hAnsi="David"/>
@@ -770,23 +1079,40 @@
           <w:bCs/>
           <w:sz w:val="23"/>
           <w:szCs w:val="23"/>
-          <w:u w:val="single"/>
-          <w:rtl/>
-        </w:rPr>
-        <w:t xml:space="preserve">ב. הפרת זכויות התובע</w:t>
-      </w:r>
-    </w:p>
-    <w:p>
-      <w:pPr>
-        <w:pStyle w:val="ListParagraph"/>
-        <w:numPr>
-          <w:ilvl w:val="0"/>
-          <w:numId w:val="2"/>
-        </w:numPr>
-        <w:bidi/>
-        <w:spacing w:after="100" w:before="0" w:line="276" w:lineRule="auto"/>
-        <w:jc w:val="both"/>
-      </w:pPr>
+          <w:rtl/>
+        </w:rPr>
+        <w:t xml:space="preserve">2,578 ₪</w:t>
+      </w:r>
+      <w:r>
+        <w:rPr>
+          <w:rFonts w:ascii="David" w:cs="David" w:eastAsia="David" w:hAnsi="David"/>
+          <w:sz w:val="23"/>
+          <w:szCs w:val="23"/>
+          <w:rtl/>
+        </w:rPr>
+        <w:t xml:space="preserve">, לפי 9 ימים × 286.44 ₪.</w:t>
+      </w:r>
+    </w:p>
+    <w:p>
+      <w:pPr>
+        <w:pStyle w:val="ListParagraph"/>
+        <w:numPr>
+          <w:ilvl w:val="0"/>
+          <w:numId w:val="2"/>
+        </w:numPr>
+        <w:bidi/>
+        <w:spacing w:after="70" w:before="0" w:line="276" w:lineRule="auto"/>
+        <w:jc w:val="both"/>
+      </w:pPr>
+      <w:r>
+        <w:rPr>
+          <w:rFonts w:ascii="David" w:cs="David" w:eastAsia="David" w:hAnsi="David"/>
+          <w:sz w:val="23"/>
+          <w:szCs w:val="23"/>
+          <w:rtl/>
+        </w:rPr>
+        <w:t xml:space="preserve">התובע זכאי לפיצוי לדוגמה בסך </w:t>
+      </w:r>
       <w:r>
         <w:rPr>
           <w:rFonts w:ascii="David" w:cs="David" w:eastAsia="David" w:hAnsi="David"/>
@@ -796,27 +1122,27 @@
           <w:szCs w:val="23"/>
           <w:rtl/>
         </w:rPr>
-        <w:t xml:space="preserve">שעות נוספות: </w:t>
-      </w:r>
-      <w:r>
-        <w:rPr>
-          <w:rFonts w:ascii="David" w:cs="David" w:eastAsia="David" w:hAnsi="David"/>
-          <w:sz w:val="23"/>
-          <w:szCs w:val="23"/>
-          <w:rtl/>
-        </w:rPr>
-        <w:t xml:space="preserve">מרישומי הנתבעת עצמה בתלושים עולה כי התובע הועסק דרך קבע במשמרות שחרגו משמונה שעות, ובחלק מהחודשים (5-6/2023, 12/2023, 1/2024) במשמרות של 12-13 שעות בממוצע. בפועל הועסק התובע דרך קבע במשמרות אירועים בנות 11-13 שעות, ורישומי הנתבעת משקפים רק חלק מהן. סעיף 20 לחוק עבודת הנוער אוסר להעסיק נער מעבר לשמונה שעות ביום, וסעיף 16 לחוק שעות עבודה ומנוחה, התשי"א-1951, מחייב גמול של 125% ו-150%. הנתבעת לא ניהלה פנקס שעות כדין, ומכוח סעיף 26ב לחוק הגנת השכר, התשי"ח-1958, נטל ההוכחה בעניין היקף השעות מוטל עליה.</w:t>
-      </w:r>
-    </w:p>
-    <w:p>
-      <w:pPr>
-        <w:pStyle w:val="ListParagraph"/>
-        <w:numPr>
-          <w:ilvl w:val="0"/>
-          <w:numId w:val="2"/>
-        </w:numPr>
-        <w:bidi/>
-        <w:spacing w:after="100" w:before="0" w:line="276" w:lineRule="auto"/>
+        <w:t xml:space="preserve">10,000 ₪</w:t>
+      </w:r>
+      <w:r>
+        <w:rPr>
+          <w:rFonts w:ascii="David" w:cs="David" w:eastAsia="David" w:hAnsi="David"/>
+          <w:sz w:val="23"/>
+          <w:szCs w:val="23"/>
+          <w:rtl/>
+        </w:rPr>
+        <w:t xml:space="preserve">: 5,000 ₪ בגין אי-מסירת הודעה על תנאי עבודה ו-5,000 ₪ בגין אי-מסירת תלושי שכר.</w:t>
+      </w:r>
+    </w:p>
+    <w:p>
+      <w:pPr>
+        <w:pStyle w:val="ListParagraph"/>
+        <w:numPr>
+          <w:ilvl w:val="0"/>
+          <w:numId w:val="2"/>
+        </w:numPr>
+        <w:bidi/>
+        <w:spacing w:after="70" w:before="0" w:line="276" w:lineRule="auto"/>
         <w:jc w:val="both"/>
       </w:pPr>
       <w:r>
@@ -828,29 +1154,17 @@
           <w:szCs w:val="23"/>
           <w:rtl/>
         </w:rPr>
-        <w:t xml:space="preserve">פיצויי פיטורים: </w:t>
-      </w:r>
-      <w:r>
-        <w:rPr>
-          <w:rFonts w:ascii="David" w:cs="David" w:eastAsia="David" w:hAnsi="David"/>
-          <w:sz w:val="23"/>
-          <w:szCs w:val="23"/>
-          <w:rtl/>
-        </w:rPr>
-        <w:t xml:space="preserve">לא שולמו כלל, אף שהתובע הועסק למעלה משנתיים וסיום עבודתו מזכה בפיצויים מכוח החוק.</w:t>
-      </w:r>
-    </w:p>
-    <w:p>
-      <w:pPr>
-        <w:pStyle w:val="ListParagraph"/>
-        <w:numPr>
-          <w:ilvl w:val="0"/>
-          <w:numId w:val="2"/>
-        </w:numPr>
-        <w:bidi/>
-        <w:spacing w:after="100" w:before="0" w:line="276" w:lineRule="auto"/>
-        <w:jc w:val="both"/>
-      </w:pPr>
+        <w:t xml:space="preserve">סיכום. </w:t>
+      </w:r>
+      <w:r>
+        <w:rPr>
+          <w:rFonts w:ascii="David" w:cs="David" w:eastAsia="David" w:hAnsi="David"/>
+          <w:sz w:val="23"/>
+          <w:szCs w:val="23"/>
+          <w:rtl/>
+        </w:rPr>
+        <w:t xml:space="preserve">על הנתבעת לשלם לתובע את הסך </w:t>
+      </w:r>
       <w:r>
         <w:rPr>
           <w:rFonts w:ascii="David" w:cs="David" w:eastAsia="David" w:hAnsi="David"/>
@@ -860,29 +1174,17 @@
           <w:szCs w:val="23"/>
           <w:rtl/>
         </w:rPr>
-        <w:t xml:space="preserve">חופשה: </w:t>
-      </w:r>
-      <w:r>
-        <w:rPr>
-          <w:rFonts w:ascii="David" w:cs="David" w:eastAsia="David" w:hAnsi="David"/>
-          <w:sz w:val="23"/>
-          <w:szCs w:val="23"/>
-          <w:rtl/>
-        </w:rPr>
-        <w:t xml:space="preserve">נער זכאי ל-18 ימי חופשה בשנה (סעיף 27 לחוק עבודת הנוער). תלוש השכר האחרון, לחודש 8/2024, מודה ביתרה של 15.26 ימים בלתי מנוצלים, ואף יתרה זו לא נפדתה, בניגוד לסעיף 13 לחוק חופשה שנתית, התשי"א-1951.</w:t>
-      </w:r>
-    </w:p>
-    <w:p>
-      <w:pPr>
-        <w:pStyle w:val="ListParagraph"/>
-        <w:numPr>
-          <w:ilvl w:val="0"/>
-          <w:numId w:val="2"/>
-        </w:numPr>
-        <w:bidi/>
-        <w:spacing w:after="100" w:before="0" w:line="276" w:lineRule="auto"/>
-        <w:jc w:val="both"/>
-      </w:pPr>
+        <w:t xml:space="preserve">52,226 ₪</w:t>
+      </w:r>
+      <w:r>
+        <w:rPr>
+          <w:rFonts w:ascii="David" w:cs="David" w:eastAsia="David" w:hAnsi="David"/>
+          <w:sz w:val="23"/>
+          <w:szCs w:val="23"/>
+          <w:rtl/>
+        </w:rPr>
+        <w:t xml:space="preserve"> בצירוף פיצויי הלנת שכר ופיצויי הלנת פיצויי פיטורים. לחלופין, בצירוף הפרשי הצמדה וריבית מקסימלית כחוק. לצורכי אגרה בלבד, ולאור מצבו הכלכלי של התובע, התביעה מוגשת אך על הסך של </w:t>
+      </w:r>
       <w:r>
         <w:rPr>
           <w:rFonts w:ascii="David" w:cs="David" w:eastAsia="David" w:hAnsi="David"/>
@@ -892,389 +1194,6 @@
           <w:szCs w:val="23"/>
           <w:rtl/>
         </w:rPr>
-        <w:t xml:space="preserve">דמי חגים: </w:t>
-      </w:r>
-      <w:r>
-        <w:rPr>
-          <w:rFonts w:ascii="David" w:cs="David" w:eastAsia="David" w:hAnsi="David"/>
-          <w:sz w:val="23"/>
-          <w:szCs w:val="23"/>
-          <w:rtl/>
-        </w:rPr>
-        <w:t xml:space="preserve">כעובד שעתי בעל ותק העולה על שלושה חודשים זכאי היה התובע לתשלום בגין תשעה ימי חג בשנה מכוח צו ההרחבה הכללי במשק (הסכם המסגרת משנת 2000). לא שולם דבר.</w:t>
-      </w:r>
-    </w:p>
-    <w:p>
-      <w:pPr>
-        <w:pStyle w:val="ListParagraph"/>
-        <w:numPr>
-          <w:ilvl w:val="0"/>
-          <w:numId w:val="2"/>
-        </w:numPr>
-        <w:bidi/>
-        <w:spacing w:after="100" w:before="0" w:line="276" w:lineRule="auto"/>
-        <w:jc w:val="both"/>
-      </w:pPr>
-      <w:r>
-        <w:rPr>
-          <w:rFonts w:ascii="David" w:cs="David" w:eastAsia="David" w:hAnsi="David"/>
-          <w:b/>
-          <w:bCs/>
-          <w:sz w:val="23"/>
-          <w:szCs w:val="23"/>
-          <w:rtl/>
-        </w:rPr>
-        <w:t xml:space="preserve">הודעה על תנאי עבודה ותלושי שכר: </w:t>
-      </w:r>
-      <w:r>
-        <w:rPr>
-          <w:rFonts w:ascii="David" w:cs="David" w:eastAsia="David" w:hAnsi="David"/>
-          <w:sz w:val="23"/>
-          <w:szCs w:val="23"/>
-          <w:rtl/>
-        </w:rPr>
-        <w:t xml:space="preserve">לא נמסרה לתובע הודעה על תנאי עבודתו, בניגוד לחוק הודעה לעובד ולמועמד לעבודה, התשס"ב-2002, ותלושי השכר לא נמסרו לו במועדם בניגוד לסעיף 24 לחוק הגנת השכר. כל אחת מההפרות מקימה זכות לפיצוי לדוגמה ללא הוכחת נזק.</w:t>
-      </w:r>
-    </w:p>
-    <w:p>
-      <w:pPr>
-        <w:bidi/>
-        <w:spacing w:after="60" w:before="60" w:line="276" w:lineRule="auto"/>
-        <w:jc w:val="start"/>
-      </w:pPr>
-      <w:r>
-        <w:rPr>
-          <w:rFonts w:ascii="David" w:cs="David" w:eastAsia="David" w:hAnsi="David"/>
-          <w:b/>
-          <w:bCs/>
-          <w:sz w:val="23"/>
-          <w:szCs w:val="23"/>
-          <w:u w:val="single"/>
-          <w:rtl/>
-        </w:rPr>
-        <w:t xml:space="preserve">ג. הסעדים</w:t>
-      </w:r>
-    </w:p>
-    <w:p>
-      <w:pPr>
-        <w:pStyle w:val="ListParagraph"/>
-        <w:numPr>
-          <w:ilvl w:val="0"/>
-          <w:numId w:val="2"/>
-        </w:numPr>
-        <w:bidi/>
-        <w:spacing w:after="100" w:before="0" w:line="276" w:lineRule="auto"/>
-        <w:jc w:val="both"/>
-      </w:pPr>
-      <w:r>
-        <w:rPr>
-          <w:rFonts w:ascii="David" w:cs="David" w:eastAsia="David" w:hAnsi="David"/>
-          <w:b/>
-          <w:bCs/>
-          <w:sz w:val="23"/>
-          <w:szCs w:val="23"/>
-          <w:rtl/>
-        </w:rPr>
-        <w:t xml:space="preserve">פיצויי פיטורים: </w:t>
-      </w:r>
-      <w:r>
-        <w:rPr>
-          <w:rFonts w:ascii="David" w:cs="David" w:eastAsia="David" w:hAnsi="David"/>
-          <w:sz w:val="23"/>
-          <w:szCs w:val="23"/>
-          <w:rtl/>
-        </w:rPr>
-        <w:t xml:space="preserve">3,500 ₪ × 29/12 חודשי עבודה = </w:t>
-      </w:r>
-      <w:r>
-        <w:rPr>
-          <w:rFonts w:ascii="David" w:cs="David" w:eastAsia="David" w:hAnsi="David"/>
-          <w:b/>
-          <w:bCs/>
-          <w:sz w:val="23"/>
-          <w:szCs w:val="23"/>
-          <w:rtl/>
-        </w:rPr>
-        <w:t xml:space="preserve">8,458 ₪</w:t>
-      </w:r>
-      <w:r>
-        <w:rPr>
-          <w:rFonts w:ascii="David" w:cs="David" w:eastAsia="David" w:hAnsi="David"/>
-          <w:sz w:val="23"/>
-          <w:szCs w:val="23"/>
-          <w:rtl/>
-        </w:rPr>
-        <w:t xml:space="preserve">.</w:t>
-      </w:r>
-    </w:p>
-    <w:p>
-      <w:pPr>
-        <w:pStyle w:val="ListParagraph"/>
-        <w:numPr>
-          <w:ilvl w:val="0"/>
-          <w:numId w:val="2"/>
-        </w:numPr>
-        <w:bidi/>
-        <w:spacing w:after="100" w:before="0" w:line="276" w:lineRule="auto"/>
-        <w:jc w:val="both"/>
-      </w:pPr>
-      <w:r>
-        <w:rPr>
-          <w:rFonts w:ascii="David" w:cs="David" w:eastAsia="David" w:hAnsi="David"/>
-          <w:b/>
-          <w:bCs/>
-          <w:sz w:val="23"/>
-          <w:szCs w:val="23"/>
-          <w:rtl/>
-        </w:rPr>
-        <w:t xml:space="preserve">גמול שעות נוספות: </w:t>
-      </w:r>
-      <w:r>
-        <w:rPr>
-          <w:rFonts w:ascii="David" w:cs="David" w:eastAsia="David" w:hAnsi="David"/>
-          <w:sz w:val="23"/>
-          <w:szCs w:val="23"/>
-          <w:rtl/>
-        </w:rPr>
-        <w:t xml:space="preserve">281 משמרות לפי התלושים × 3 שעות נוספות למשמרת (משמרת ממוצעת של 11 שעות): שתי שעות ב-125% ושעה ב-150%, 120 ₪ למשמרת לפי 30 ₪ לשעה, = 33,720 ₪, בניכוי 8,545 ₪ ששולמו כשכר יסוד שעתי, ובסה"כ </w:t>
-      </w:r>
-      <w:r>
-        <w:rPr>
-          <w:rFonts w:ascii="David" w:cs="David" w:eastAsia="David" w:hAnsi="David"/>
-          <w:b/>
-          <w:bCs/>
-          <w:sz w:val="23"/>
-          <w:szCs w:val="23"/>
-          <w:rtl/>
-        </w:rPr>
-        <w:t xml:space="preserve">25,175 ₪</w:t>
-      </w:r>
-      <w:r>
-        <w:rPr>
-          <w:rFonts w:ascii="David" w:cs="David" w:eastAsia="David" w:hAnsi="David"/>
-          <w:sz w:val="23"/>
-          <w:szCs w:val="23"/>
-          <w:rtl/>
-        </w:rPr>
-        <w:t xml:space="preserve">. החישוב נופל מחזקת 15 השעות הנוספות השבועיות שבסעיף 26ב לחוק הגנת השכר. לחלופין, ולכל הפחות, לפי רישומי הנתבעת עצמה בתלושים: 475 שעות נוספות, ובסה"כ 11,049 ₪.</w:t>
-      </w:r>
-    </w:p>
-    <w:p>
-      <w:pPr>
-        <w:pStyle w:val="ListParagraph"/>
-        <w:numPr>
-          <w:ilvl w:val="0"/>
-          <w:numId w:val="2"/>
-        </w:numPr>
-        <w:bidi/>
-        <w:spacing w:after="100" w:before="0" w:line="276" w:lineRule="auto"/>
-        <w:jc w:val="both"/>
-      </w:pPr>
-      <w:r>
-        <w:rPr>
-          <w:rFonts w:ascii="David" w:cs="David" w:eastAsia="David" w:hAnsi="David"/>
-          <w:b/>
-          <w:bCs/>
-          <w:sz w:val="23"/>
-          <w:szCs w:val="23"/>
-          <w:rtl/>
-        </w:rPr>
-        <w:t xml:space="preserve">פדיון חופשה: </w:t>
-      </w:r>
-      <w:r>
-        <w:rPr>
-          <w:rFonts w:ascii="David" w:cs="David" w:eastAsia="David" w:hAnsi="David"/>
-          <w:sz w:val="23"/>
-          <w:szCs w:val="23"/>
-          <w:rtl/>
-        </w:rPr>
-        <w:t xml:space="preserve">21 ימים (18 ימים לשנה, באופן יחסי לימי העבודה בפועל) × 286.44 ₪, תעריף יום לפי התלוש, ובסה"כ </w:t>
-      </w:r>
-      <w:r>
-        <w:rPr>
-          <w:rFonts w:ascii="David" w:cs="David" w:eastAsia="David" w:hAnsi="David"/>
-          <w:b/>
-          <w:bCs/>
-          <w:sz w:val="23"/>
-          <w:szCs w:val="23"/>
-          <w:rtl/>
-        </w:rPr>
-        <w:t xml:space="preserve">6,015 ₪</w:t>
-      </w:r>
-      <w:r>
-        <w:rPr>
-          <w:rFonts w:ascii="David" w:cs="David" w:eastAsia="David" w:hAnsi="David"/>
-          <w:sz w:val="23"/>
-          <w:szCs w:val="23"/>
-          <w:rtl/>
-        </w:rPr>
-        <w:t xml:space="preserve">.</w:t>
-      </w:r>
-    </w:p>
-    <w:p>
-      <w:pPr>
-        <w:pStyle w:val="ListParagraph"/>
-        <w:numPr>
-          <w:ilvl w:val="0"/>
-          <w:numId w:val="2"/>
-        </w:numPr>
-        <w:bidi/>
-        <w:spacing w:after="100" w:before="0" w:line="276" w:lineRule="auto"/>
-        <w:jc w:val="both"/>
-      </w:pPr>
-      <w:r>
-        <w:rPr>
-          <w:rFonts w:ascii="David" w:cs="David" w:eastAsia="David" w:hAnsi="David"/>
-          <w:b/>
-          <w:bCs/>
-          <w:sz w:val="23"/>
-          <w:szCs w:val="23"/>
-          <w:rtl/>
-        </w:rPr>
-        <w:t xml:space="preserve">דמי חגים: </w:t>
-      </w:r>
-      <w:r>
-        <w:rPr>
-          <w:rFonts w:ascii="David" w:cs="David" w:eastAsia="David" w:hAnsi="David"/>
-          <w:sz w:val="23"/>
-          <w:szCs w:val="23"/>
-          <w:rtl/>
-        </w:rPr>
-        <w:t xml:space="preserve">9 ימים × 286.44 ₪ = </w:t>
-      </w:r>
-      <w:r>
-        <w:rPr>
-          <w:rFonts w:ascii="David" w:cs="David" w:eastAsia="David" w:hAnsi="David"/>
-          <w:b/>
-          <w:bCs/>
-          <w:sz w:val="23"/>
-          <w:szCs w:val="23"/>
-          <w:rtl/>
-        </w:rPr>
-        <w:t xml:space="preserve">2,578 ₪</w:t>
-      </w:r>
-      <w:r>
-        <w:rPr>
-          <w:rFonts w:ascii="David" w:cs="David" w:eastAsia="David" w:hAnsi="David"/>
-          <w:sz w:val="23"/>
-          <w:szCs w:val="23"/>
-          <w:rtl/>
-        </w:rPr>
-        <w:t xml:space="preserve">.</w:t>
-      </w:r>
-    </w:p>
-    <w:p>
-      <w:pPr>
-        <w:pStyle w:val="ListParagraph"/>
-        <w:numPr>
-          <w:ilvl w:val="0"/>
-          <w:numId w:val="2"/>
-        </w:numPr>
-        <w:bidi/>
-        <w:spacing w:after="100" w:before="0" w:line="276" w:lineRule="auto"/>
-        <w:jc w:val="both"/>
-      </w:pPr>
-      <w:r>
-        <w:rPr>
-          <w:rFonts w:ascii="David" w:cs="David" w:eastAsia="David" w:hAnsi="David"/>
-          <w:b/>
-          <w:bCs/>
-          <w:sz w:val="23"/>
-          <w:szCs w:val="23"/>
-          <w:rtl/>
-        </w:rPr>
-        <w:t xml:space="preserve">פיצוי לדוגמה: </w:t>
-      </w:r>
-      <w:r>
-        <w:rPr>
-          <w:rFonts w:ascii="David" w:cs="David" w:eastAsia="David" w:hAnsi="David"/>
-          <w:sz w:val="23"/>
-          <w:szCs w:val="23"/>
-          <w:rtl/>
-        </w:rPr>
-        <w:t xml:space="preserve">5,000 ₪ בגין אי-מסירת הודעה על תנאי עבודה ו-5,000 ₪ בגין אי-מסירת תלושי שכר, ובסה"כ </w:t>
-      </w:r>
-      <w:r>
-        <w:rPr>
-          <w:rFonts w:ascii="David" w:cs="David" w:eastAsia="David" w:hAnsi="David"/>
-          <w:b/>
-          <w:bCs/>
-          <w:sz w:val="23"/>
-          <w:szCs w:val="23"/>
-          <w:rtl/>
-        </w:rPr>
-        <w:t xml:space="preserve">10,000 ₪</w:t>
-      </w:r>
-      <w:r>
-        <w:rPr>
-          <w:rFonts w:ascii="David" w:cs="David" w:eastAsia="David" w:hAnsi="David"/>
-          <w:sz w:val="23"/>
-          <w:szCs w:val="23"/>
-          <w:rtl/>
-        </w:rPr>
-        <w:t xml:space="preserve">.</w:t>
-      </w:r>
-    </w:p>
-    <w:p>
-      <w:pPr>
-        <w:pStyle w:val="ListParagraph"/>
-        <w:numPr>
-          <w:ilvl w:val="0"/>
-          <w:numId w:val="2"/>
-        </w:numPr>
-        <w:bidi/>
-        <w:spacing w:after="100" w:before="0" w:line="276" w:lineRule="auto"/>
-        <w:jc w:val="both"/>
-      </w:pPr>
-      <w:r>
-        <w:rPr>
-          <w:rFonts w:ascii="David" w:cs="David" w:eastAsia="David" w:hAnsi="David"/>
-          <w:b/>
-          <w:bCs/>
-          <w:sz w:val="23"/>
-          <w:szCs w:val="23"/>
-          <w:rtl/>
-        </w:rPr>
-        <w:t xml:space="preserve">סיכום. </w:t>
-      </w:r>
-      <w:r>
-        <w:rPr>
-          <w:rFonts w:ascii="David" w:cs="David" w:eastAsia="David" w:hAnsi="David"/>
-          <w:sz w:val="23"/>
-          <w:szCs w:val="23"/>
-          <w:rtl/>
-        </w:rPr>
-        <w:t xml:space="preserve">על הנתבעת לשלם לתובע את הסך </w:t>
-      </w:r>
-      <w:r>
-        <w:rPr>
-          <w:rFonts w:ascii="David" w:cs="David" w:eastAsia="David" w:hAnsi="David"/>
-          <w:b/>
-          <w:bCs/>
-          <w:sz w:val="23"/>
-          <w:szCs w:val="23"/>
-          <w:rtl/>
-        </w:rPr>
-        <w:t xml:space="preserve">52,226 ₪</w:t>
-      </w:r>
-      <w:r>
-        <w:rPr>
-          <w:rFonts w:ascii="David" w:cs="David" w:eastAsia="David" w:hAnsi="David"/>
-          <w:sz w:val="23"/>
-          <w:szCs w:val="23"/>
-          <w:rtl/>
-        </w:rPr>
-        <w:t xml:space="preserve"> בצירוף פיצויי הלנת שכר ופיצויי הלנת פיצויי פיטורים. לחלופין, בצירוף הפרשי הצמדה וריבית מקסימלית כחוק. לצורכי אגרה בלבד, ולאור מצבו הכלכלי של התובע, התביעה מוגשת אך על הסך של </w:t>
-      </w:r>
-      <w:r>
-        <w:rPr>
-          <w:rFonts w:ascii="David" w:cs="David" w:eastAsia="David" w:hAnsi="David"/>
-          <w:b/>
-          <w:bCs/>
-          <w:sz w:val="23"/>
-          <w:szCs w:val="23"/>
-          <w:rtl/>
-        </w:rPr>
         <w:t xml:space="preserve">50,000 ₪</w:t>
       </w:r>
       <w:r>
@@ -1295,59 +1214,59 @@
           <w:numId w:val="2"/>
         </w:numPr>
         <w:bidi/>
-        <w:spacing w:after="100" w:before="0" w:line="276" w:lineRule="auto"/>
-        <w:jc w:val="both"/>
-      </w:pPr>
-      <w:r>
-        <w:rPr>
-          <w:rFonts w:ascii="David" w:cs="David" w:eastAsia="David" w:hAnsi="David"/>
-          <w:sz w:val="23"/>
-          <w:szCs w:val="23"/>
-          <w:rtl/>
-        </w:rPr>
-        <w:t xml:space="preserve">לבית דין נכבד זה הסמכות העניינית לדון בתביעה מכוח סעיף 24(א)(1) לחוק בית הדין לעבודה, התשכ"ט-1969, והסמכות המקומית נתונה לו בהיות מקום ביצוע העבודה באזור שיפוטו.</w:t>
-      </w:r>
-    </w:p>
-    <w:p>
-      <w:pPr>
-        <w:pStyle w:val="ListParagraph"/>
-        <w:numPr>
-          <w:ilvl w:val="0"/>
-          <w:numId w:val="2"/>
-        </w:numPr>
-        <w:bidi/>
-        <w:spacing w:after="100" w:before="0" w:line="276" w:lineRule="auto"/>
-        <w:jc w:val="both"/>
-      </w:pPr>
-      <w:r>
-        <w:rPr>
-          <w:rFonts w:ascii="David" w:cs="David" w:eastAsia="David" w:hAnsi="David"/>
-          <w:sz w:val="23"/>
-          <w:szCs w:val="23"/>
-          <w:rtl/>
-        </w:rPr>
-        <w:t xml:space="preserve">התובע שומר על זכותו לתקן את כתב התביעה ולהוסיף עליו עם קבלת מלוא המסמכים מהנתבעת, ואין באמור לעיל כדי לגרוע מכל זכות העומדת לו על פי כל דין, הסכם, נוהג או צו הרחבה.</w:t>
-      </w:r>
-    </w:p>
-    <w:p>
-      <w:pPr>
-        <w:pStyle w:val="ListParagraph"/>
-        <w:numPr>
-          <w:ilvl w:val="0"/>
-          <w:numId w:val="2"/>
-        </w:numPr>
-        <w:bidi/>
-        <w:spacing w:after="100" w:before="0" w:line="276" w:lineRule="auto"/>
-        <w:jc w:val="both"/>
-      </w:pPr>
-      <w:r>
-        <w:rPr>
-          <w:rFonts w:ascii="David" w:cs="David" w:eastAsia="David" w:hAnsi="David"/>
-          <w:sz w:val="23"/>
-          <w:szCs w:val="23"/>
-          <w:rtl/>
-        </w:rPr>
-        <w:t xml:space="preserve">אשר על כן מתבקש בית הדין הנכבד להזמין את הנתבעת לדין, לחייבה בתשלום הסכומים המפורטים לעיל, וכן לחייבה בהוצאות המשפט ובשכר טרחת עו"ד בתוספת מע"מ כדין.</w:t>
+        <w:spacing w:after="70" w:before="0" w:line="276" w:lineRule="auto"/>
+        <w:jc w:val="both"/>
+      </w:pPr>
+      <w:r>
+        <w:rPr>
+          <w:rFonts w:ascii="David" w:cs="David" w:eastAsia="David" w:hAnsi="David"/>
+          <w:sz w:val="23"/>
+          <w:szCs w:val="23"/>
+          <w:rtl/>
+        </w:rPr>
+        <w:t xml:space="preserve">לבית דין נכבד זה הסמכות העניינית מכוח סעיף 24(א)(1) לחוק בית הדין לעבודה, התשכ"ט-1969, והסמכות המקומית בהיות מקום ביצוע העבודה באזור שיפוטו.</w:t>
+      </w:r>
+    </w:p>
+    <w:p>
+      <w:pPr>
+        <w:pStyle w:val="ListParagraph"/>
+        <w:numPr>
+          <w:ilvl w:val="0"/>
+          <w:numId w:val="2"/>
+        </w:numPr>
+        <w:bidi/>
+        <w:spacing w:after="70" w:before="0" w:line="276" w:lineRule="auto"/>
+        <w:jc w:val="both"/>
+      </w:pPr>
+      <w:r>
+        <w:rPr>
+          <w:rFonts w:ascii="David" w:cs="David" w:eastAsia="David" w:hAnsi="David"/>
+          <w:sz w:val="23"/>
+          <w:szCs w:val="23"/>
+          <w:rtl/>
+        </w:rPr>
+        <w:t xml:space="preserve">אין באמור לעיל כדי למצות או לגרוע מכל טענה או זכות העומדת לתובע על פי כל דין, הסכם, נוהג או צו הרחבה, והתובע שומר על זכותו לתקן את כתב התביעה עם קבלת מלוא המסמכים מהנתבעת.</w:t>
+      </w:r>
+    </w:p>
+    <w:p>
+      <w:pPr>
+        <w:pStyle w:val="ListParagraph"/>
+        <w:numPr>
+          <w:ilvl w:val="0"/>
+          <w:numId w:val="2"/>
+        </w:numPr>
+        <w:bidi/>
+        <w:spacing w:after="70" w:before="0" w:line="276" w:lineRule="auto"/>
+        <w:jc w:val="both"/>
+      </w:pPr>
+      <w:r>
+        <w:rPr>
+          <w:rFonts w:ascii="David" w:cs="David" w:eastAsia="David" w:hAnsi="David"/>
+          <w:sz w:val="23"/>
+          <w:szCs w:val="23"/>
+          <w:rtl/>
+        </w:rPr>
+        <w:t xml:space="preserve">כמו כן, על הנתבעת לשאת בהוצאות המשפט ובשכר טרחת עו"ד בתוספת מע"מ כדין.</w:t>
       </w:r>
     </w:p>
     <w:p>

</xml_diff>

<commit_message>
Omer Almo claim: flat structure, short clauses, filed on full 52,226 ILS
Co-Authored-By: Claude Fable 5.1 <noreply@anthropic.com>
Claude-Session: https://claude.ai/code/session_01LZZvntJ3pJMoHrEfkbpmK5
</commit_message>
<xml_diff>
--- a/labor-claim-omer-almo/כתב_תביעה_עומר_אלמו.docx
+++ b/labor-claim-omer-almo/כתב_תביעה_עומר_אלמו.docx
@@ -505,7 +505,7 @@
           <w:szCs w:val="23"/>
           <w:rtl/>
         </w:rPr>
-        <w:t xml:space="preserve">52,226 ₪ (לצורכי אגרה: 50,000 ₪).</w:t>
+        <w:t xml:space="preserve">52,226 ₪.</w:t>
       </w:r>
     </w:p>
     <w:p>
@@ -1183,27 +1183,7 @@
           <w:szCs w:val="23"/>
           <w:rtl/>
         </w:rPr>
-        <w:t xml:space="preserve"> בצירוף פיצויי הלנת שכר ופיצויי הלנת פיצויי פיטורים. לחלופין, בצירוף הפרשי הצמדה וריבית מקסימלית כחוק. לצורכי אגרה בלבד, ולאור מצבו הכלכלי של התובע, התביעה מוגשת אך על הסך של </w:t>
-      </w:r>
-      <w:r>
-        <w:rPr>
-          <w:rFonts w:ascii="David" w:cs="David" w:eastAsia="David" w:hAnsi="David"/>
-          <w:b/>
-          <w:bCs/>
-          <w:sz w:val="23"/>
-          <w:szCs w:val="23"/>
-          <w:rtl/>
-        </w:rPr>
-        <w:t xml:space="preserve">50,000 ₪</w:t>
-      </w:r>
-      <w:r>
-        <w:rPr>
-          <w:rFonts w:ascii="David" w:cs="David" w:eastAsia="David" w:hAnsi="David"/>
-          <w:sz w:val="23"/>
-          <w:szCs w:val="23"/>
-          <w:rtl/>
-        </w:rPr>
-        <w:t xml:space="preserve">, כאשר התובע שומר לעצמו את הזכות לשלם הפרשי אגרה ולהעמיד את התביעה על סכומה המקורי הנ"ל.</w:t>
+        <w:t xml:space="preserve"> בצירוף פיצויי הלנת שכר ופיצויי הלנת פיצויי פיטורים. לחלופין, בצירוף הפרשי הצמדה וריבית מקסימלית כחוק.</w:t>
       </w:r>
     </w:p>
     <w:p>

</xml_diff>

<commit_message>
Omer Almo claim: raise to 63,120 ILS (exemplary damages 20,000, vacation at statutory daily wage), drop late-payment penalties
Co-Authored-By: Claude Fable 5.1 <noreply@anthropic.com>
Claude-Session: https://claude.ai/code/session_01LZZvntJ3pJMoHrEfkbpmK5
</commit_message>
<xml_diff>
--- a/labor-claim-omer-almo/כתב_תביעה_עומר_אלמו.docx
+++ b/labor-claim-omer-almo/כתב_תביעה_עומר_אלמו.docx
@@ -120,7 +120,7 @@
                 <w:szCs w:val="23"/>
                 <w:rtl/>
               </w:rPr>
-              <w:t xml:space="preserve">תאריך: 09.09.2026</w:t>
+              <w:t xml:space="preserve">תאריך: 10.09.2026</w:t>
             </w:r>
           </w:p>
         </w:tc>
@@ -505,7 +505,7 @@
           <w:szCs w:val="23"/>
           <w:rtl/>
         </w:rPr>
-        <w:t xml:space="preserve">52,226 ₪.</w:t>
+        <w:t xml:space="preserve">63,120 ₪.</w:t>
       </w:r>
     </w:p>
     <w:p>
@@ -1040,16 +1040,16 @@
           <w:szCs w:val="23"/>
           <w:rtl/>
         </w:rPr>
-        <w:t xml:space="preserve">6,015 ₪</w:t>
-      </w:r>
-      <w:r>
-        <w:rPr>
-          <w:rFonts w:ascii="David" w:cs="David" w:eastAsia="David" w:hAnsi="David"/>
-          <w:sz w:val="23"/>
-          <w:szCs w:val="23"/>
-          <w:rtl/>
-        </w:rPr>
-        <w:t xml:space="preserve">, לפי 21 ימים (18 ימים לשנה, באופן יחסי לימי העבודה בפועל) × 286.44 ₪, תעריף יום לפי התלוש.</w:t>
+        <w:t xml:space="preserve">6,909 ₪</w:t>
+      </w:r>
+      <w:r>
+        <w:rPr>
+          <w:rFonts w:ascii="David" w:cs="David" w:eastAsia="David" w:hAnsi="David"/>
+          <w:sz w:val="23"/>
+          <w:szCs w:val="23"/>
+          <w:rtl/>
+        </w:rPr>
+        <w:t xml:space="preserve">, לפי 21 ימים (18 ימים לשנה, באופן יחסי לימי העבודה בפועל) × 329 ₪, שכרו היומי הממוצע לפי סעיף 10 לחוק חופשה שנתית (92,533 ₪ שכר לכל התקופה / 281 ימי עבודה).</w:t>
       </w:r>
     </w:p>
     <w:p>
@@ -1122,16 +1122,16 @@
           <w:szCs w:val="23"/>
           <w:rtl/>
         </w:rPr>
-        <w:t xml:space="preserve">10,000 ₪</w:t>
-      </w:r>
-      <w:r>
-        <w:rPr>
-          <w:rFonts w:ascii="David" w:cs="David" w:eastAsia="David" w:hAnsi="David"/>
-          <w:sz w:val="23"/>
-          <w:szCs w:val="23"/>
-          <w:rtl/>
-        </w:rPr>
-        <w:t xml:space="preserve">: 5,000 ₪ בגין אי-מסירת הודעה על תנאי עבודה ו-5,000 ₪ בגין אי-מסירת תלושי שכר.</w:t>
+        <w:t xml:space="preserve">20,000 ₪</w:t>
+      </w:r>
+      <w:r>
+        <w:rPr>
+          <w:rFonts w:ascii="David" w:cs="David" w:eastAsia="David" w:hAnsi="David"/>
+          <w:sz w:val="23"/>
+          <w:szCs w:val="23"/>
+          <w:rtl/>
+        </w:rPr>
+        <w:t xml:space="preserve">: 10,000 ₪ בגין אי-מסירת הודעה על תנאי עבודה לעובד קטין, ו-10,000 ₪ בגין אי-מסירת 27 תלושי שכר לאורך כל תקופת העבודה, אשר הופקו לראשונה שנתיים לאחר סיומה.</w:t>
       </w:r>
     </w:p>
     <w:p>
@@ -1174,16 +1174,16 @@
           <w:szCs w:val="23"/>
           <w:rtl/>
         </w:rPr>
-        <w:t xml:space="preserve">52,226 ₪</w:t>
-      </w:r>
-      <w:r>
-        <w:rPr>
-          <w:rFonts w:ascii="David" w:cs="David" w:eastAsia="David" w:hAnsi="David"/>
-          <w:sz w:val="23"/>
-          <w:szCs w:val="23"/>
-          <w:rtl/>
-        </w:rPr>
-        <w:t xml:space="preserve"> בצירוף פיצויי הלנת שכר ופיצויי הלנת פיצויי פיטורים. לחלופין, בצירוף הפרשי הצמדה וריבית מקסימלית כחוק.</w:t>
+        <w:t xml:space="preserve">63,120 ₪</w:t>
+      </w:r>
+      <w:r>
+        <w:rPr>
+          <w:rFonts w:ascii="David" w:cs="David" w:eastAsia="David" w:hAnsi="David"/>
+          <w:sz w:val="23"/>
+          <w:szCs w:val="23"/>
+          <w:rtl/>
+        </w:rPr>
+        <w:t xml:space="preserve">, בצירוף הפרשי הצמדה וריבית כחוק ממועד היווצרות כל אחד מהחיובים ועד התשלום בפועל.</w:t>
       </w:r>
     </w:p>
     <w:p>

</xml_diff>